<commit_message>
Actualizacion mar. 15/09/2026 13:19:53,64
</commit_message>
<xml_diff>
--- a/fontana_escritorio/fontana_escritorio_documentacion.docx
+++ b/fontana_escritorio/fontana_escritorio_documentacion.docx
@@ -4,27 +4,27 @@
   <w:body>
     <w:p>
       <w:pPr>
-        <w:spacing w:after="80"/>
+        <w:spacing w:after="120"/>
       </w:pPr>
       <w:r>
         <w:rPr>
           <w:b/>
           <w:bCs/>
-          <w:sz w:val="44"/>
-          <w:szCs w:val="44"/>
+          <w:sz w:val="56"/>
+          <w:szCs w:val="56"/>
         </w:rPr>
         <w:t xml:space="preserve">fontana_escritorio</w:t>
       </w:r>
     </w:p>
     <w:p>
       <w:pPr>
-        <w:spacing w:after="40"/>
+        <w:spacing w:after="80"/>
       </w:pPr>
       <w:r>
         <w:rPr>
           <w:color w:val="444444"/>
-          <w:sz w:val="26"/>
-          <w:szCs w:val="26"/>
+          <w:sz w:val="28"/>
+          <w:szCs w:val="28"/>
         </w:rPr>
         <w:t xml:space="preserve">Versión de escritorio (Python + Tkinter) de fontana_movimientos</w:t>
       </w:r>
@@ -38,16 +38,24 @@
           <w:i/>
           <w:iCs/>
           <w:color w:val="777777"/>
-          <w:sz w:val="20"/>
-          <w:szCs w:val="20"/>
-        </w:rPr>
-        <w:t xml:space="preserve">Documento de referencia — 8 de septiembre de 2026</w:t>
-      </w:r>
+          <w:sz w:val="22"/>
+          <w:szCs w:val="22"/>
+        </w:rPr>
+        <w:t xml:space="preserve">Documento de referencia — 15 de septiembre de 2026</w:t>
+      </w:r>
+    </w:p>
+    <w:p>
+      <w:pPr>
+        <w:pBdr>
+          <w:bottom w:val="single" w:color="AAAAAA" w:sz="6" w:space="4"/>
+        </w:pBdr>
+        <w:spacing w:after="240"/>
+      </w:pPr>
     </w:p>
     <w:p>
       <w:pPr>
         <w:pStyle w:val="Heading1"/>
-        <w:spacing w:after="160" w:before="320"/>
+        <w:spacing w:after="160" w:before="360"/>
       </w:pPr>
       <w:r>
         <w:t xml:space="preserve">1. Qué es y por qué existe</w:t>
@@ -74,18 +82,18 @@
         <w:spacing w:after="160"/>
       </w:pPr>
       <w:r>
-        <w:t xml:space="preserve">Migrar los 13 módulos de una sola vez no es realista en una sola sesión de trabajo, así que el proyecto se arma módulo por módulo, reusando siempre las mismas tablas y las mismas reglas de negocio que ya tiene la versión Django, para no duplicar lógica que después se desincroniza entre las dos versiones.</w:t>
-      </w:r>
-    </w:p>
-    <w:p>
-      <w:pPr>
-        <w:spacing w:after="60" w:before="160"/>
+        <w:t xml:space="preserve">Migrar los 13 módulos de una sola vez no es realista en una sola sesión de trabajo, así que el proyecto se arma módulo por módulo, reusando siempre las mismas tablas y las mismas reglas de negocio que ya tiene la versión Django, para no duplicar lógica que después se desincroniza entre las dos versiones. Hasta ahora se avanzó con Entidades, Productos y Movimientos (los tres completos) y Comprobantes (cabecera completa, renglones pendientes).</w:t>
+      </w:r>
+    </w:p>
+    <w:p>
+      <w:pPr>
+        <w:spacing w:after="80" w:before="120"/>
         <w:jc w:val="center"/>
       </w:pPr>
       <w:r>
         <w:drawing>
           <wp:inline distT="0" distB="0" distL="0" distR="0">
-            <wp:extent cx="5524500" cy="1895475"/>
+            <wp:extent cx="5667375" cy="1924050"/>
             <wp:effectExtent t="0" r="0" b="0" l="0"/>
             <wp:docPr id="1" name="" descr="" title=""/>
             <wp:cNvGraphicFramePr>
@@ -110,7 +118,7 @@
                   <pic:spPr bwMode="auto">
                     <a:xfrm>
                       <a:off x="0" y="0"/>
-                      <a:ext cx="5524500" cy="1895475"/>
+                      <a:ext cx="5667375" cy="1924050"/>
                     </a:xfrm>
                     <a:prstGeom prst="rect">
                       <a:avLst/>
@@ -125,7 +133,7 @@
     </w:p>
     <w:p>
       <w:pPr>
-        <w:spacing w:after="260"/>
+        <w:spacing w:after="240"/>
         <w:jc w:val="center"/>
       </w:pPr>
       <w:r>
@@ -133,8 +141,8 @@
           <w:i/>
           <w:iCs/>
           <w:color w:val="555555"/>
-          <w:sz w:val="19"/>
-          <w:szCs w:val="19"/>
+          <w:sz w:val="20"/>
+          <w:szCs w:val="20"/>
         </w:rPr>
         <w:t xml:space="preserve">Ambas versiones (web y escritorio) conviven y comparten la misma base.</w:t>
       </w:r>
@@ -142,7 +150,7 @@
     <w:p>
       <w:pPr>
         <w:pStyle w:val="Heading1"/>
-        <w:spacing w:after="160" w:before="320"/>
+        <w:spacing w:after="160" w:before="360"/>
       </w:pPr>
       <w:r>
         <w:t xml:space="preserve">2. Arquitectura interna</w:t>
@@ -153,17 +161,17 @@
         <w:spacing w:after="160"/>
       </w:pPr>
       <w:r>
-        <w:t xml:space="preserve">Cada módulo (Entidades, Productos, y los que se vayan agregando) sigue siempre el mismo patrón de dos archivos, para que el acceso a datos se pueda revisar o probar por separado de la interfaz gráfica:</w:t>
-      </w:r>
-    </w:p>
-    <w:p>
-      <w:pPr>
-        <w:pStyle w:val="ListParagraph"/>
-        <w:numPr>
-          <w:ilvl w:val="0"/>
-          <w:numId w:val="2"/>
-        </w:numPr>
-        <w:spacing w:after="90"/>
+        <w:t xml:space="preserve">Cada módulo sigue siempre el mismo patrón de dos archivos, para que el acceso a datos se pueda revisar o probar por separado de la interfaz gráfica:</w:t>
+      </w:r>
+    </w:p>
+    <w:p>
+      <w:pPr>
+        <w:pStyle w:val="ListParagraph"/>
+        <w:numPr>
+          <w:ilvl w:val="0"/>
+          <w:numId w:val="1"/>
+        </w:numPr>
+        <w:spacing w:after="80"/>
       </w:pPr>
       <w:r>
         <w:rPr>
@@ -181,9 +189,9 @@
         <w:pStyle w:val="ListParagraph"/>
         <w:numPr>
           <w:ilvl w:val="0"/>
-          <w:numId w:val="2"/>
-        </w:numPr>
-        <w:spacing w:after="90"/>
+          <w:numId w:val="1"/>
+        </w:numPr>
+        <w:spacing w:after="80"/>
       </w:pPr>
       <w:r>
         <w:rPr>
@@ -198,13 +206,41 @@
     </w:p>
     <w:p>
       <w:pPr>
-        <w:spacing w:after="60" w:before="160"/>
+        <w:spacing w:after="160"/>
+      </w:pPr>
+      <w:r>
+        <w:t xml:space="preserve">A partir de Movimientos se sumó también un módulo compartido, reusable por cualquier pantalla que necesite exportar un listado:</w:t>
+      </w:r>
+    </w:p>
+    <w:p>
+      <w:pPr>
+        <w:pStyle w:val="ListParagraph"/>
+        <w:numPr>
+          <w:ilvl w:val="0"/>
+          <w:numId w:val="1"/>
+        </w:numPr>
+        <w:spacing w:after="80"/>
+      </w:pPr>
+      <w:r>
+        <w:rPr>
+          <w:b/>
+          <w:bCs/>
+        </w:rPr>
+        <w:t xml:space="preserve">reportes.py</w:t>
+      </w:r>
+      <w:r>
+        <w:t xml:space="preserve">: exportar_excel(ruta, resultado) y exportar_pdf(ruta, titulo, resultado) -- adaptación a escritorio (guarda en un archivo local en vez de descargar desde el navegador) de services/reportes.py del proyecto Django, con el mismo formato de tabla y estilos.</w:t>
+      </w:r>
+    </w:p>
+    <w:p>
+      <w:pPr>
+        <w:spacing w:after="80" w:before="120"/>
         <w:jc w:val="center"/>
       </w:pPr>
       <w:r>
         <w:drawing>
           <wp:inline distT="0" distB="0" distL="0" distR="0">
-            <wp:extent cx="5524500" cy="2743200"/>
+            <wp:extent cx="5943600" cy="1733550"/>
             <wp:effectExtent t="0" r="0" b="0" l="0"/>
             <wp:docPr id="1" name="" descr="" title=""/>
             <wp:cNvGraphicFramePr>
@@ -229,7 +265,7 @@
                   <pic:spPr bwMode="auto">
                     <a:xfrm>
                       <a:off x="0" y="0"/>
-                      <a:ext cx="5524500" cy="2743200"/>
+                      <a:ext cx="5943600" cy="1733550"/>
                     </a:xfrm>
                     <a:prstGeom prst="rect">
                       <a:avLst/>
@@ -244,7 +280,7 @@
     </w:p>
     <w:p>
       <w:pPr>
-        <w:spacing w:after="260"/>
+        <w:spacing w:after="240"/>
         <w:jc w:val="center"/>
       </w:pPr>
       <w:r>
@@ -252,8 +288,8 @@
           <w:i/>
           <w:iCs/>
           <w:color w:val="555555"/>
-          <w:sz w:val="19"/>
-          <w:szCs w:val="19"/>
+          <w:sz w:val="20"/>
+          <w:szCs w:val="20"/>
         </w:rPr>
         <w:t xml:space="preserve">app.py arma la ventana principal (una pestaña por módulo); db.py centraliza la conexión a MySQL, leyendo las credenciales de un archivo .env.</w:t>
       </w:r>
@@ -261,7 +297,7 @@
     <w:p>
       <w:pPr>
         <w:pStyle w:val="Heading1"/>
-        <w:spacing w:after="160" w:before="320"/>
+        <w:spacing w:after="160" w:before="360"/>
       </w:pPr>
       <w:r>
         <w:t xml:space="preserve">3. Decisiones de diseño</w:t>
@@ -272,9 +308,9 @@
         <w:pStyle w:val="ListParagraph"/>
         <w:numPr>
           <w:ilvl w:val="0"/>
-          <w:numId w:val="2"/>
-        </w:numPr>
-        <w:spacing w:after="90"/>
+          <w:numId w:val="1"/>
+        </w:numPr>
+        <w:spacing w:after="80"/>
       </w:pPr>
       <w:r>
         <w:rPr>
@@ -292,9 +328,9 @@
         <w:pStyle w:val="ListParagraph"/>
         <w:numPr>
           <w:ilvl w:val="0"/>
-          <w:numId w:val="2"/>
-        </w:numPr>
-        <w:spacing w:after="90"/>
+          <w:numId w:val="1"/>
+        </w:numPr>
+        <w:spacing w:after="80"/>
       </w:pPr>
       <w:r>
         <w:rPr>
@@ -304,43 +340,63 @@
         <w:t xml:space="preserve">IDs de tablas legadas asignados a mano: </w:t>
       </w:r>
       <w:r>
-        <w:t xml:space="preserve">"entidad" y "producto_detalle" no se tratan como autoincrementales -- se calcula MAX(id)+1 antes de cada alta, igual que hace el propio proyecto Django para estas mismas tablas, para no arriesgarse a chocar con un id ya usado si la columna no fuera realmente AUTO_INCREMENT.</w:t>
-      </w:r>
-    </w:p>
-    <w:p>
-      <w:pPr>
-        <w:pStyle w:val="ListParagraph"/>
-        <w:numPr>
-          <w:ilvl w:val="0"/>
-          <w:numId w:val="2"/>
-        </w:numPr>
-        <w:spacing w:after="90"/>
+        <w:t xml:space="preserve">"entidad", "producto_detalle" y "comprobante" no se tratan como autoincrementales -- se calcula MAX(id)+1 antes de cada alta, igual que hace el propio proyecto Django para estas mismas tablas, para no arriesgarse a chocar con un id ya usado si la columna no fuera realmente AUTO_INCREMENT.</w:t>
+      </w:r>
+    </w:p>
+    <w:p>
+      <w:pPr>
+        <w:pStyle w:val="ListParagraph"/>
+        <w:numPr>
+          <w:ilvl w:val="0"/>
+          <w:numId w:val="1"/>
+        </w:numPr>
+        <w:spacing w:after="80"/>
       </w:pPr>
       <w:r>
         <w:rPr>
           <w:b/>
           <w:bCs/>
         </w:rPr>
-        <w:t xml:space="preserve">Baja de Entidad = activo=0, nunca DELETE: </w:t>
-      </w:r>
-      <w:r>
-        <w:t xml:space="preserve">mismo criterio que la web -- no se borra una entidad, se la marca inactiva y se puede reactivar.</w:t>
-      </w:r>
-    </w:p>
-    <w:p>
-      <w:pPr>
-        <w:pStyle w:val="ListParagraph"/>
-        <w:numPr>
-          <w:ilvl w:val="0"/>
-          <w:numId w:val="2"/>
-        </w:numPr>
-        <w:spacing w:after="90"/>
+        <w:t xml:space="preserve">"movimiento" es la excepción: </w:t>
+      </w:r>
+      <w:r>
+        <w:t xml:space="preserve">a diferencia de las anteriores, el modelo Django la declara como AutoField real, así que en Movimientos el alta deja que MySQL asigne el id (cursor.lastrowid) en vez de calcularlo a mano.</w:t>
+      </w:r>
+    </w:p>
+    <w:p>
+      <w:pPr>
+        <w:pStyle w:val="ListParagraph"/>
+        <w:numPr>
+          <w:ilvl w:val="0"/>
+          <w:numId w:val="1"/>
+        </w:numPr>
+        <w:spacing w:after="80"/>
       </w:pPr>
       <w:r>
         <w:rPr>
           <w:b/>
           <w:bCs/>
         </w:rPr>
+        <w:t xml:space="preserve">Baja de Entidad = activo=0, nunca DELETE: </w:t>
+      </w:r>
+      <w:r>
+        <w:t xml:space="preserve">mismo criterio que la web -- no se borra una entidad, se la marca inactiva y se puede reactivar.</w:t>
+      </w:r>
+    </w:p>
+    <w:p>
+      <w:pPr>
+        <w:pStyle w:val="ListParagraph"/>
+        <w:numPr>
+          <w:ilvl w:val="0"/>
+          <w:numId w:val="1"/>
+        </w:numPr>
+        <w:spacing w:after="80"/>
+      </w:pPr>
+      <w:r>
+        <w:rPr>
+          <w:b/>
+          <w:bCs/>
+        </w:rPr>
         <w:t xml:space="preserve">Eliminar Producto sí es DELETE real, </w:t>
       </w:r>
       <w:r>
@@ -349,8 +405,48 @@
     </w:p>
     <w:p>
       <w:pPr>
+        <w:pStyle w:val="ListParagraph"/>
+        <w:numPr>
+          <w:ilvl w:val="0"/>
+          <w:numId w:val="1"/>
+        </w:numPr>
+        <w:spacing w:after="80"/>
+      </w:pPr>
+      <w:r>
+        <w:rPr>
+          <w:b/>
+          <w:bCs/>
+        </w:rPr>
+        <w:t xml:space="preserve">Eliminar Movimiento </w:t>
+      </w:r>
+      <w:r>
+        <w:t xml:space="preserve">intenta el DELETE directo y muestra un aviso si la base lo rechaza (por ejemplo por tener pesaje o datos de H.V. de Yerba Mate asociados) -- mismo resultado que ve el usuario en la web, sin tener que adivinar acá todas las tablas que podrían referenciarlo.</w:t>
+      </w:r>
+    </w:p>
+    <w:p>
+      <w:pPr>
+        <w:pStyle w:val="ListParagraph"/>
+        <w:numPr>
+          <w:ilvl w:val="0"/>
+          <w:numId w:val="1"/>
+        </w:numPr>
+        <w:spacing w:after="80"/>
+      </w:pPr>
+      <w:r>
+        <w:rPr>
+          <w:b/>
+          <w:bCs/>
+        </w:rPr>
+        <w:t xml:space="preserve">Eliminar Comprobante </w:t>
+      </w:r>
+      <w:r>
+        <w:t xml:space="preserve">replica a mano el efecto de on_delete=CASCADE que tiene Django: se borran primero sus renglones (comprobante_renglon / comprobante_renglon_detalle) y su tipo de cambio si tenía, y recién ahí la cabecera. El chequeo específico de la vista Django (no dejar borrar un comprobante ya incluido en una Liquidación) todavía NO está replicado -- Liquidaciones sigue pendiente de investigar.</w:t>
+      </w:r>
+    </w:p>
+    <w:p>
+      <w:pPr>
         <w:pStyle w:val="Heading1"/>
-        <w:spacing w:after="160" w:before="320"/>
+        <w:spacing w:after="160" w:before="360"/>
       </w:pPr>
       <w:r>
         <w:t xml:space="preserve">4. Estado actual</w:t>
@@ -358,7 +454,7 @@
     </w:p>
     <w:tbl>
       <w:tblPr>
-        <w:tblW w:type="dxa" w:w="10000"/>
+        <w:tblW w:type="dxa" w:w="10080"/>
         <w:tblBorders>
           <w:top w:val="single" w:color="auto" w:sz="4"/>
           <w:left w:val="single" w:color="auto" w:sz="4"/>
@@ -369,33 +465,28 @@
         </w:tblBorders>
       </w:tblPr>
       <w:tblGrid>
-        <w:gridCol w:w="3600"/>
-        <w:gridCol w:w="1900"/>
-        <w:gridCol w:w="4500"/>
+        <w:gridCol w:w="2600"/>
+        <w:gridCol w:w="1500"/>
+        <w:gridCol w:w="5860"/>
       </w:tblGrid>
       <w:tr>
-        <w:trPr>
-          <w:tblHeader/>
-        </w:trPr>
-        <w:tc>
-          <w:tcPr>
-            <w:tcW w:type="dxa" w:w="3600"/>
-            <w:shd w:fill="D9E2F3" w:val="clear"/>
-            <w:tcMar>
-              <w:top w:type="dxa" w:w="80"/>
-              <w:left w:type="dxa" w:w="100"/>
-              <w:bottom w:type="dxa" w:w="80"/>
-              <w:right w:type="dxa" w:w="100"/>
-            </w:tcMar>
-          </w:tcPr>
-          <w:p>
-            <w:pPr>
-              <w:jc w:val="left"/>
-            </w:pPr>
+        <w:tc>
+          <w:tcPr>
+            <w:tcW w:type="dxa" w:w="2600"/>
+            <w:shd w:fill="343A40" w:val="clear"/>
+            <w:tcMar>
+              <w:top w:type="dxa" w:w="80"/>
+              <w:left w:type="dxa" w:w="100"/>
+              <w:bottom w:type="dxa" w:w="80"/>
+              <w:right w:type="dxa" w:w="100"/>
+            </w:tcMar>
+          </w:tcPr>
+          <w:p>
             <w:r>
               <w:rPr>
                 <w:b/>
                 <w:bCs/>
+                <w:color w:val="FFFFFF"/>
                 <w:sz w:val="20"/>
                 <w:szCs w:val="20"/>
               </w:rPr>
@@ -405,23 +496,21 @@
         </w:tc>
         <w:tc>
           <w:tcPr>
-            <w:tcW w:type="dxa" w:w="1900"/>
-            <w:shd w:fill="D9E2F3" w:val="clear"/>
-            <w:tcMar>
-              <w:top w:type="dxa" w:w="80"/>
-              <w:left w:type="dxa" w:w="100"/>
-              <w:bottom w:type="dxa" w:w="80"/>
-              <w:right w:type="dxa" w:w="100"/>
-            </w:tcMar>
-          </w:tcPr>
-          <w:p>
-            <w:pPr>
-              <w:jc w:val="center"/>
-            </w:pPr>
+            <w:tcW w:type="dxa" w:w="1500"/>
+            <w:shd w:fill="343A40" w:val="clear"/>
+            <w:tcMar>
+              <w:top w:type="dxa" w:w="80"/>
+              <w:left w:type="dxa" w:w="100"/>
+              <w:bottom w:type="dxa" w:w="80"/>
+              <w:right w:type="dxa" w:w="100"/>
+            </w:tcMar>
+          </w:tcPr>
+          <w:p>
             <w:r>
               <w:rPr>
                 <w:b/>
                 <w:bCs/>
+                <w:color w:val="FFFFFF"/>
                 <w:sz w:val="20"/>
                 <w:szCs w:val="20"/>
               </w:rPr>
@@ -431,23 +520,21 @@
         </w:tc>
         <w:tc>
           <w:tcPr>
-            <w:tcW w:type="dxa" w:w="4500"/>
-            <w:shd w:fill="D9E2F3" w:val="clear"/>
-            <w:tcMar>
-              <w:top w:type="dxa" w:w="80"/>
-              <w:left w:type="dxa" w:w="100"/>
-              <w:bottom w:type="dxa" w:w="80"/>
-              <w:right w:type="dxa" w:w="100"/>
-            </w:tcMar>
-          </w:tcPr>
-          <w:p>
-            <w:pPr>
-              <w:jc w:val="left"/>
-            </w:pPr>
+            <w:tcW w:type="dxa" w:w="5860"/>
+            <w:shd w:fill="343A40" w:val="clear"/>
+            <w:tcMar>
+              <w:top w:type="dxa" w:w="80"/>
+              <w:left w:type="dxa" w:w="100"/>
+              <w:bottom w:type="dxa" w:w="80"/>
+              <w:right w:type="dxa" w:w="100"/>
+            </w:tcMar>
+          </w:tcPr>
+          <w:p>
             <w:r>
               <w:rPr>
                 <w:b/>
                 <w:bCs/>
+                <w:color w:val="FFFFFF"/>
                 <w:sz w:val="20"/>
                 <w:szCs w:val="20"/>
               </w:rPr>
@@ -459,18 +546,15 @@
       <w:tr>
         <w:tc>
           <w:tcPr>
-            <w:tcW w:type="dxa" w:w="3600"/>
-            <w:tcMar>
-              <w:top w:type="dxa" w:w="80"/>
-              <w:left w:type="dxa" w:w="100"/>
-              <w:bottom w:type="dxa" w:w="80"/>
-              <w:right w:type="dxa" w:w="100"/>
-            </w:tcMar>
-          </w:tcPr>
-          <w:p>
-            <w:pPr>
-              <w:jc w:val="left"/>
-            </w:pPr>
+            <w:tcW w:type="dxa" w:w="2600"/>
+            <w:tcMar>
+              <w:top w:type="dxa" w:w="80"/>
+              <w:left w:type="dxa" w:w="100"/>
+              <w:bottom w:type="dxa" w:w="80"/>
+              <w:right w:type="dxa" w:w="100"/>
+            </w:tcMar>
+          </w:tcPr>
+          <w:p>
             <w:r>
               <w:rPr>
                 <w:b w:val="false"/>
@@ -484,18 +568,15 @@
         </w:tc>
         <w:tc>
           <w:tcPr>
-            <w:tcW w:type="dxa" w:w="1900"/>
-            <w:tcMar>
-              <w:top w:type="dxa" w:w="80"/>
-              <w:left w:type="dxa" w:w="100"/>
-              <w:bottom w:type="dxa" w:w="80"/>
-              <w:right w:type="dxa" w:w="100"/>
-            </w:tcMar>
-          </w:tcPr>
-          <w:p>
-            <w:pPr>
-              <w:jc w:val="center"/>
-            </w:pPr>
+            <w:tcW w:type="dxa" w:w="1500"/>
+            <w:tcMar>
+              <w:top w:type="dxa" w:w="80"/>
+              <w:left w:type="dxa" w:w="100"/>
+              <w:bottom w:type="dxa" w:w="80"/>
+              <w:right w:type="dxa" w:w="100"/>
+            </w:tcMar>
+          </w:tcPr>
+          <w:p>
             <w:r>
               <w:rPr>
                 <w:b w:val="false"/>
@@ -509,18 +590,15 @@
         </w:tc>
         <w:tc>
           <w:tcPr>
-            <w:tcW w:type="dxa" w:w="4500"/>
-            <w:tcMar>
-              <w:top w:type="dxa" w:w="80"/>
-              <w:left w:type="dxa" w:w="100"/>
-              <w:bottom w:type="dxa" w:w="80"/>
-              <w:right w:type="dxa" w:w="100"/>
-            </w:tcMar>
-          </w:tcPr>
-          <w:p>
-            <w:pPr>
-              <w:jc w:val="left"/>
-            </w:pPr>
+            <w:tcW w:type="dxa" w:w="5860"/>
+            <w:tcMar>
+              <w:top w:type="dxa" w:w="80"/>
+              <w:left w:type="dxa" w:w="100"/>
+              <w:bottom w:type="dxa" w:w="80"/>
+              <w:right w:type="dxa" w:w="100"/>
+            </w:tcMar>
+          </w:tcPr>
+          <w:p>
             <w:r>
               <w:rPr>
                 <w:b w:val="false"/>
@@ -536,19 +614,15 @@
       <w:tr>
         <w:tc>
           <w:tcPr>
-            <w:tcW w:type="dxa" w:w="3600"/>
-            <w:shd w:fill="F7F9FC" w:val="clear"/>
-            <w:tcMar>
-              <w:top w:type="dxa" w:w="80"/>
-              <w:left w:type="dxa" w:w="100"/>
-              <w:bottom w:type="dxa" w:w="80"/>
-              <w:right w:type="dxa" w:w="100"/>
-            </w:tcMar>
-          </w:tcPr>
-          <w:p>
-            <w:pPr>
-              <w:jc w:val="left"/>
-            </w:pPr>
+            <w:tcW w:type="dxa" w:w="2600"/>
+            <w:tcMar>
+              <w:top w:type="dxa" w:w="80"/>
+              <w:left w:type="dxa" w:w="100"/>
+              <w:bottom w:type="dxa" w:w="80"/>
+              <w:right w:type="dxa" w:w="100"/>
+            </w:tcMar>
+          </w:tcPr>
+          <w:p>
             <w:r>
               <w:rPr>
                 <w:b w:val="false"/>
@@ -562,19 +636,15 @@
         </w:tc>
         <w:tc>
           <w:tcPr>
-            <w:tcW w:type="dxa" w:w="1900"/>
-            <w:shd w:fill="F7F9FC" w:val="clear"/>
-            <w:tcMar>
-              <w:top w:type="dxa" w:w="80"/>
-              <w:left w:type="dxa" w:w="100"/>
-              <w:bottom w:type="dxa" w:w="80"/>
-              <w:right w:type="dxa" w:w="100"/>
-            </w:tcMar>
-          </w:tcPr>
-          <w:p>
-            <w:pPr>
-              <w:jc w:val="center"/>
-            </w:pPr>
+            <w:tcW w:type="dxa" w:w="1500"/>
+            <w:tcMar>
+              <w:top w:type="dxa" w:w="80"/>
+              <w:left w:type="dxa" w:w="100"/>
+              <w:bottom w:type="dxa" w:w="80"/>
+              <w:right w:type="dxa" w:w="100"/>
+            </w:tcMar>
+          </w:tcPr>
+          <w:p>
             <w:r>
               <w:rPr>
                 <w:b w:val="false"/>
@@ -588,19 +658,15 @@
         </w:tc>
         <w:tc>
           <w:tcPr>
-            <w:tcW w:type="dxa" w:w="4500"/>
-            <w:shd w:fill="F7F9FC" w:val="clear"/>
-            <w:tcMar>
-              <w:top w:type="dxa" w:w="80"/>
-              <w:left w:type="dxa" w:w="100"/>
-              <w:bottom w:type="dxa" w:w="80"/>
-              <w:right w:type="dxa" w:w="100"/>
-            </w:tcMar>
-          </w:tcPr>
-          <w:p>
-            <w:pPr>
-              <w:jc w:val="left"/>
-            </w:pPr>
+            <w:tcW w:type="dxa" w:w="5860"/>
+            <w:tcMar>
+              <w:top w:type="dxa" w:w="80"/>
+              <w:left w:type="dxa" w:w="100"/>
+              <w:bottom w:type="dxa" w:w="80"/>
+              <w:right w:type="dxa" w:w="100"/>
+            </w:tcMar>
+          </w:tcPr>
+          <w:p>
             <w:r>
               <w:rPr>
                 <w:b w:val="false"/>
@@ -616,18 +682,15 @@
       <w:tr>
         <w:tc>
           <w:tcPr>
-            <w:tcW w:type="dxa" w:w="3600"/>
-            <w:tcMar>
-              <w:top w:type="dxa" w:w="80"/>
-              <w:left w:type="dxa" w:w="100"/>
-              <w:bottom w:type="dxa" w:w="80"/>
-              <w:right w:type="dxa" w:w="100"/>
-            </w:tcMar>
-          </w:tcPr>
-          <w:p>
-            <w:pPr>
-              <w:jc w:val="left"/>
-            </w:pPr>
+            <w:tcW w:type="dxa" w:w="2600"/>
+            <w:tcMar>
+              <w:top w:type="dxa" w:w="80"/>
+              <w:left w:type="dxa" w:w="100"/>
+              <w:bottom w:type="dxa" w:w="80"/>
+              <w:right w:type="dxa" w:w="100"/>
+            </w:tcMar>
+          </w:tcPr>
+          <w:p>
             <w:r>
               <w:rPr>
                 <w:b w:val="false"/>
@@ -641,51 +704,45 @@
         </w:tc>
         <w:tc>
           <w:tcPr>
-            <w:tcW w:type="dxa" w:w="1900"/>
-            <w:tcMar>
-              <w:top w:type="dxa" w:w="80"/>
-              <w:left w:type="dxa" w:w="100"/>
-              <w:bottom w:type="dxa" w:w="80"/>
-              <w:right w:type="dxa" w:w="100"/>
-            </w:tcMar>
-          </w:tcPr>
-          <w:p>
-            <w:pPr>
-              <w:jc w:val="center"/>
-            </w:pPr>
-            <w:r>
-              <w:rPr>
-                <w:b w:val="false"/>
-                <w:bCs w:val="false"/>
-                <w:sz w:val="20"/>
-                <w:szCs w:val="20"/>
-              </w:rPr>
-              <w:t xml:space="preserve">⬜ Pendiente</w:t>
-            </w:r>
-          </w:p>
-        </w:tc>
-        <w:tc>
-          <w:tcPr>
-            <w:tcW w:type="dxa" w:w="4500"/>
-            <w:tcMar>
-              <w:top w:type="dxa" w:w="80"/>
-              <w:left w:type="dxa" w:w="100"/>
-              <w:bottom w:type="dxa" w:w="80"/>
-              <w:right w:type="dxa" w:w="100"/>
-            </w:tcMar>
-          </w:tcPr>
-          <w:p>
-            <w:pPr>
-              <w:jc w:val="left"/>
-            </w:pPr>
-            <w:r>
-              <w:rPr>
-                <w:b w:val="false"/>
-                <w:bCs w:val="false"/>
-                <w:sz w:val="20"/>
-                <w:szCs w:val="20"/>
-              </w:rPr>
-              <w:t xml:space="preserve">Próximo módulo a implementar.</w:t>
+            <w:tcW w:type="dxa" w:w="1500"/>
+            <w:tcMar>
+              <w:top w:type="dxa" w:w="80"/>
+              <w:left w:type="dxa" w:w="100"/>
+              <w:bottom w:type="dxa" w:w="80"/>
+              <w:right w:type="dxa" w:w="100"/>
+            </w:tcMar>
+          </w:tcPr>
+          <w:p>
+            <w:r>
+              <w:rPr>
+                <w:b w:val="false"/>
+                <w:bCs w:val="false"/>
+                <w:sz w:val="20"/>
+                <w:szCs w:val="20"/>
+              </w:rPr>
+              <w:t xml:space="preserve">✅ Hecho</w:t>
+            </w:r>
+          </w:p>
+        </w:tc>
+        <w:tc>
+          <w:tcPr>
+            <w:tcW w:type="dxa" w:w="5860"/>
+            <w:tcMar>
+              <w:top w:type="dxa" w:w="80"/>
+              <w:left w:type="dxa" w:w="100"/>
+              <w:bottom w:type="dxa" w:w="80"/>
+              <w:right w:type="dxa" w:w="100"/>
+            </w:tcMar>
+          </w:tcPr>
+          <w:p>
+            <w:r>
+              <w:rPr>
+                <w:b w:val="false"/>
+                <w:bCs w:val="false"/>
+                <w:sz w:val="20"/>
+                <w:szCs w:val="20"/>
+              </w:rPr>
+              <w:t xml:space="preserve">Listado/búsqueda, alta, edición, eliminar; recepción y salida canchada de H.V. Yerba Mate; salida genérica; ranking de productores con exportación a Excel/PDF.</w:t>
             </w:r>
           </w:p>
         </w:tc>
@@ -693,19 +750,15 @@
       <w:tr>
         <w:tc>
           <w:tcPr>
-            <w:tcW w:type="dxa" w:w="3600"/>
-            <w:shd w:fill="F7F9FC" w:val="clear"/>
-            <w:tcMar>
-              <w:top w:type="dxa" w:w="80"/>
-              <w:left w:type="dxa" w:w="100"/>
-              <w:bottom w:type="dxa" w:w="80"/>
-              <w:right w:type="dxa" w:w="100"/>
-            </w:tcMar>
-          </w:tcPr>
-          <w:p>
-            <w:pPr>
-              <w:jc w:val="left"/>
-            </w:pPr>
+            <w:tcW w:type="dxa" w:w="2600"/>
+            <w:tcMar>
+              <w:top w:type="dxa" w:w="80"/>
+              <w:left w:type="dxa" w:w="100"/>
+              <w:bottom w:type="dxa" w:w="80"/>
+              <w:right w:type="dxa" w:w="100"/>
+            </w:tcMar>
+          </w:tcPr>
+          <w:p>
             <w:r>
               <w:rPr>
                 <w:b w:val="false"/>
@@ -719,53 +772,45 @@
         </w:tc>
         <w:tc>
           <w:tcPr>
-            <w:tcW w:type="dxa" w:w="1900"/>
-            <w:shd w:fill="F7F9FC" w:val="clear"/>
-            <w:tcMar>
-              <w:top w:type="dxa" w:w="80"/>
-              <w:left w:type="dxa" w:w="100"/>
-              <w:bottom w:type="dxa" w:w="80"/>
-              <w:right w:type="dxa" w:w="100"/>
-            </w:tcMar>
-          </w:tcPr>
-          <w:p>
-            <w:pPr>
-              <w:jc w:val="center"/>
-            </w:pPr>
-            <w:r>
-              <w:rPr>
-                <w:b w:val="false"/>
-                <w:bCs w:val="false"/>
-                <w:sz w:val="20"/>
-                <w:szCs w:val="20"/>
-              </w:rPr>
-              <w:t xml:space="preserve">⬜ Pendiente</w:t>
-            </w:r>
-          </w:p>
-        </w:tc>
-        <w:tc>
-          <w:tcPr>
-            <w:tcW w:type="dxa" w:w="4500"/>
-            <w:shd w:fill="F7F9FC" w:val="clear"/>
-            <w:tcMar>
-              <w:top w:type="dxa" w:w="80"/>
-              <w:left w:type="dxa" w:w="100"/>
-              <w:bottom w:type="dxa" w:w="80"/>
-              <w:right w:type="dxa" w:w="100"/>
-            </w:tcMar>
-          </w:tcPr>
-          <w:p>
-            <w:pPr>
-              <w:jc w:val="left"/>
-            </w:pPr>
-            <w:r>
-              <w:rPr>
-                <w:b w:val="false"/>
-                <w:bCs w:val="false"/>
-                <w:sz w:val="20"/>
-                <w:szCs w:val="20"/>
-              </w:rPr>
-              <w:t xml:space="preserve">Lo usan Liquidaciones y Cuenta Corriente de Productos.</w:t>
+            <w:tcW w:type="dxa" w:w="1500"/>
+            <w:tcMar>
+              <w:top w:type="dxa" w:w="80"/>
+              <w:left w:type="dxa" w:w="100"/>
+              <w:bottom w:type="dxa" w:w="80"/>
+              <w:right w:type="dxa" w:w="100"/>
+            </w:tcMar>
+          </w:tcPr>
+          <w:p>
+            <w:r>
+              <w:rPr>
+                <w:b w:val="false"/>
+                <w:bCs w:val="false"/>
+                <w:sz w:val="20"/>
+                <w:szCs w:val="20"/>
+              </w:rPr>
+              <w:t xml:space="preserve">🟡 Parcial</w:t>
+            </w:r>
+          </w:p>
+        </w:tc>
+        <w:tc>
+          <w:tcPr>
+            <w:tcW w:type="dxa" w:w="5860"/>
+            <w:tcMar>
+              <w:top w:type="dxa" w:w="80"/>
+              <w:left w:type="dxa" w:w="100"/>
+              <w:bottom w:type="dxa" w:w="80"/>
+              <w:right w:type="dxa" w:w="100"/>
+            </w:tcMar>
+          </w:tcPr>
+          <w:p>
+            <w:r>
+              <w:rPr>
+                <w:b w:val="false"/>
+                <w:bCs w:val="false"/>
+                <w:sz w:val="20"/>
+                <w:szCs w:val="20"/>
+              </w:rPr>
+              <w:t xml:space="preserve">Cabecera completa (listado, alta, edición, eliminar). Faltan renglones, tipo de cambio y reportes/rankings.</w:t>
             </w:r>
           </w:p>
         </w:tc>
@@ -773,18 +818,15 @@
       <w:tr>
         <w:tc>
           <w:tcPr>
-            <w:tcW w:type="dxa" w:w="3600"/>
-            <w:tcMar>
-              <w:top w:type="dxa" w:w="80"/>
-              <w:left w:type="dxa" w:w="100"/>
-              <w:bottom w:type="dxa" w:w="80"/>
-              <w:right w:type="dxa" w:w="100"/>
-            </w:tcMar>
-          </w:tcPr>
-          <w:p>
-            <w:pPr>
-              <w:jc w:val="left"/>
-            </w:pPr>
+            <w:tcW w:type="dxa" w:w="2600"/>
+            <w:tcMar>
+              <w:top w:type="dxa" w:w="80"/>
+              <w:left w:type="dxa" w:w="100"/>
+              <w:bottom w:type="dxa" w:w="80"/>
+              <w:right w:type="dxa" w:w="100"/>
+            </w:tcMar>
+          </w:tcPr>
+          <w:p>
             <w:r>
               <w:rPr>
                 <w:b w:val="false"/>
@@ -798,18 +840,15 @@
         </w:tc>
         <w:tc>
           <w:tcPr>
-            <w:tcW w:type="dxa" w:w="1900"/>
-            <w:tcMar>
-              <w:top w:type="dxa" w:w="80"/>
-              <w:left w:type="dxa" w:w="100"/>
-              <w:bottom w:type="dxa" w:w="80"/>
-              <w:right w:type="dxa" w:w="100"/>
-            </w:tcMar>
-          </w:tcPr>
-          <w:p>
-            <w:pPr>
-              <w:jc w:val="center"/>
-            </w:pPr>
+            <w:tcW w:type="dxa" w:w="1500"/>
+            <w:tcMar>
+              <w:top w:type="dxa" w:w="80"/>
+              <w:left w:type="dxa" w:w="100"/>
+              <w:bottom w:type="dxa" w:w="80"/>
+              <w:right w:type="dxa" w:w="100"/>
+            </w:tcMar>
+          </w:tcPr>
+          <w:p>
             <w:r>
               <w:rPr>
                 <w:b w:val="false"/>
@@ -823,26 +862,23 @@
         </w:tc>
         <w:tc>
           <w:tcPr>
-            <w:tcW w:type="dxa" w:w="4500"/>
-            <w:tcMar>
-              <w:top w:type="dxa" w:w="80"/>
-              <w:left w:type="dxa" w:w="100"/>
-              <w:bottom w:type="dxa" w:w="80"/>
-              <w:right w:type="dxa" w:w="100"/>
-            </w:tcMar>
-          </w:tcPr>
-          <w:p>
-            <w:pPr>
-              <w:jc w:val="left"/>
-            </w:pPr>
-            <w:r>
-              <w:rPr>
-                <w:b w:val="false"/>
-                <w:bCs w:val="false"/>
-                <w:sz w:val="20"/>
-                <w:szCs w:val="20"/>
-              </w:rPr>
-              <w:t xml:space="preserve"/>
+            <w:tcW w:type="dxa" w:w="5860"/>
+            <w:tcMar>
+              <w:top w:type="dxa" w:w="80"/>
+              <w:left w:type="dxa" w:w="100"/>
+              <w:bottom w:type="dxa" w:w="80"/>
+              <w:right w:type="dxa" w:w="100"/>
+            </w:tcMar>
+          </w:tcPr>
+          <w:p>
+            <w:r>
+              <w:rPr>
+                <w:b w:val="false"/>
+                <w:bCs w:val="false"/>
+                <w:sz w:val="20"/>
+                <w:szCs w:val="20"/>
+              </w:rPr>
+              <w:t xml:space="preserve">Próximo módulo a implementar.</w:t>
             </w:r>
           </w:p>
         </w:tc>
@@ -850,19 +886,15 @@
       <w:tr>
         <w:tc>
           <w:tcPr>
-            <w:tcW w:type="dxa" w:w="3600"/>
-            <w:shd w:fill="F7F9FC" w:val="clear"/>
-            <w:tcMar>
-              <w:top w:type="dxa" w:w="80"/>
-              <w:left w:type="dxa" w:w="100"/>
-              <w:bottom w:type="dxa" w:w="80"/>
-              <w:right w:type="dxa" w:w="100"/>
-            </w:tcMar>
-          </w:tcPr>
-          <w:p>
-            <w:pPr>
-              <w:jc w:val="left"/>
-            </w:pPr>
+            <w:tcW w:type="dxa" w:w="2600"/>
+            <w:tcMar>
+              <w:top w:type="dxa" w:w="80"/>
+              <w:left w:type="dxa" w:w="100"/>
+              <w:bottom w:type="dxa" w:w="80"/>
+              <w:right w:type="dxa" w:w="100"/>
+            </w:tcMar>
+          </w:tcPr>
+          <w:p>
             <w:r>
               <w:rPr>
                 <w:b w:val="false"/>
@@ -876,19 +908,15 @@
         </w:tc>
         <w:tc>
           <w:tcPr>
-            <w:tcW w:type="dxa" w:w="1900"/>
-            <w:shd w:fill="F7F9FC" w:val="clear"/>
-            <w:tcMar>
-              <w:top w:type="dxa" w:w="80"/>
-              <w:left w:type="dxa" w:w="100"/>
-              <w:bottom w:type="dxa" w:w="80"/>
-              <w:right w:type="dxa" w:w="100"/>
-            </w:tcMar>
-          </w:tcPr>
-          <w:p>
-            <w:pPr>
-              <w:jc w:val="center"/>
-            </w:pPr>
+            <w:tcW w:type="dxa" w:w="1500"/>
+            <w:tcMar>
+              <w:top w:type="dxa" w:w="80"/>
+              <w:left w:type="dxa" w:w="100"/>
+              <w:bottom w:type="dxa" w:w="80"/>
+              <w:right w:type="dxa" w:w="100"/>
+            </w:tcMar>
+          </w:tcPr>
+          <w:p>
             <w:r>
               <w:rPr>
                 <w:b w:val="false"/>
@@ -902,19 +930,15 @@
         </w:tc>
         <w:tc>
           <w:tcPr>
-            <w:tcW w:type="dxa" w:w="4500"/>
-            <w:shd w:fill="F7F9FC" w:val="clear"/>
-            <w:tcMar>
-              <w:top w:type="dxa" w:w="80"/>
-              <w:left w:type="dxa" w:w="100"/>
-              <w:bottom w:type="dxa" w:w="80"/>
-              <w:right w:type="dxa" w:w="100"/>
-            </w:tcMar>
-          </w:tcPr>
-          <w:p>
-            <w:pPr>
-              <w:jc w:val="left"/>
-            </w:pPr>
+            <w:tcW w:type="dxa" w:w="5860"/>
+            <w:tcMar>
+              <w:top w:type="dxa" w:w="80"/>
+              <w:left w:type="dxa" w:w="100"/>
+              <w:bottom w:type="dxa" w:w="80"/>
+              <w:right w:type="dxa" w:w="100"/>
+            </w:tcMar>
+          </w:tcPr>
+          <w:p>
             <w:r>
               <w:rPr>
                 <w:b w:val="false"/>
@@ -930,18 +954,15 @@
       <w:tr>
         <w:tc>
           <w:tcPr>
-            <w:tcW w:type="dxa" w:w="3600"/>
-            <w:tcMar>
-              <w:top w:type="dxa" w:w="80"/>
-              <w:left w:type="dxa" w:w="100"/>
-              <w:bottom w:type="dxa" w:w="80"/>
-              <w:right w:type="dxa" w:w="100"/>
-            </w:tcMar>
-          </w:tcPr>
-          <w:p>
-            <w:pPr>
-              <w:jc w:val="left"/>
-            </w:pPr>
+            <w:tcW w:type="dxa" w:w="2600"/>
+            <w:tcMar>
+              <w:top w:type="dxa" w:w="80"/>
+              <w:left w:type="dxa" w:w="100"/>
+              <w:bottom w:type="dxa" w:w="80"/>
+              <w:right w:type="dxa" w:w="100"/>
+            </w:tcMar>
+          </w:tcPr>
+          <w:p>
             <w:r>
               <w:rPr>
                 <w:b w:val="false"/>
@@ -955,18 +976,15 @@
         </w:tc>
         <w:tc>
           <w:tcPr>
-            <w:tcW w:type="dxa" w:w="1900"/>
-            <w:tcMar>
-              <w:top w:type="dxa" w:w="80"/>
-              <w:left w:type="dxa" w:w="100"/>
-              <w:bottom w:type="dxa" w:w="80"/>
-              <w:right w:type="dxa" w:w="100"/>
-            </w:tcMar>
-          </w:tcPr>
-          <w:p>
-            <w:pPr>
-              <w:jc w:val="center"/>
-            </w:pPr>
+            <w:tcW w:type="dxa" w:w="1500"/>
+            <w:tcMar>
+              <w:top w:type="dxa" w:w="80"/>
+              <w:left w:type="dxa" w:w="100"/>
+              <w:bottom w:type="dxa" w:w="80"/>
+              <w:right w:type="dxa" w:w="100"/>
+            </w:tcMar>
+          </w:tcPr>
+          <w:p>
             <w:r>
               <w:rPr>
                 <w:b w:val="false"/>
@@ -980,18 +998,15 @@
         </w:tc>
         <w:tc>
           <w:tcPr>
-            <w:tcW w:type="dxa" w:w="4500"/>
-            <w:tcMar>
-              <w:top w:type="dxa" w:w="80"/>
-              <w:left w:type="dxa" w:w="100"/>
-              <w:bottom w:type="dxa" w:w="80"/>
-              <w:right w:type="dxa" w:w="100"/>
-            </w:tcMar>
-          </w:tcPr>
-          <w:p>
-            <w:pPr>
-              <w:jc w:val="left"/>
-            </w:pPr>
+            <w:tcW w:type="dxa" w:w="5860"/>
+            <w:tcMar>
+              <w:top w:type="dxa" w:w="80"/>
+              <w:left w:type="dxa" w:w="100"/>
+              <w:bottom w:type="dxa" w:w="80"/>
+              <w:right w:type="dxa" w:w="100"/>
+            </w:tcMar>
+          </w:tcPr>
+          <w:p>
             <w:r>
               <w:rPr>
                 <w:b w:val="false"/>
@@ -1007,19 +1022,15 @@
       <w:tr>
         <w:tc>
           <w:tcPr>
-            <w:tcW w:type="dxa" w:w="3600"/>
-            <w:shd w:fill="F7F9FC" w:val="clear"/>
-            <w:tcMar>
-              <w:top w:type="dxa" w:w="80"/>
-              <w:left w:type="dxa" w:w="100"/>
-              <w:bottom w:type="dxa" w:w="80"/>
-              <w:right w:type="dxa" w:w="100"/>
-            </w:tcMar>
-          </w:tcPr>
-          <w:p>
-            <w:pPr>
-              <w:jc w:val="left"/>
-            </w:pPr>
+            <w:tcW w:type="dxa" w:w="2600"/>
+            <w:tcMar>
+              <w:top w:type="dxa" w:w="80"/>
+              <w:left w:type="dxa" w:w="100"/>
+              <w:bottom w:type="dxa" w:w="80"/>
+              <w:right w:type="dxa" w:w="100"/>
+            </w:tcMar>
+          </w:tcPr>
+          <w:p>
             <w:r>
               <w:rPr>
                 <w:b w:val="false"/>
@@ -1033,19 +1044,15 @@
         </w:tc>
         <w:tc>
           <w:tcPr>
-            <w:tcW w:type="dxa" w:w="1900"/>
-            <w:shd w:fill="F7F9FC" w:val="clear"/>
-            <w:tcMar>
-              <w:top w:type="dxa" w:w="80"/>
-              <w:left w:type="dxa" w:w="100"/>
-              <w:bottom w:type="dxa" w:w="80"/>
-              <w:right w:type="dxa" w:w="100"/>
-            </w:tcMar>
-          </w:tcPr>
-          <w:p>
-            <w:pPr>
-              <w:jc w:val="center"/>
-            </w:pPr>
+            <w:tcW w:type="dxa" w:w="1500"/>
+            <w:tcMar>
+              <w:top w:type="dxa" w:w="80"/>
+              <w:left w:type="dxa" w:w="100"/>
+              <w:bottom w:type="dxa" w:w="80"/>
+              <w:right w:type="dxa" w:w="100"/>
+            </w:tcMar>
+          </w:tcPr>
+          <w:p>
             <w:r>
               <w:rPr>
                 <w:b w:val="false"/>
@@ -1059,19 +1066,15 @@
         </w:tc>
         <w:tc>
           <w:tcPr>
-            <w:tcW w:type="dxa" w:w="4500"/>
-            <w:shd w:fill="F7F9FC" w:val="clear"/>
-            <w:tcMar>
-              <w:top w:type="dxa" w:w="80"/>
-              <w:left w:type="dxa" w:w="100"/>
-              <w:bottom w:type="dxa" w:w="80"/>
-              <w:right w:type="dxa" w:w="100"/>
-            </w:tcMar>
-          </w:tcPr>
-          <w:p>
-            <w:pPr>
-              <w:jc w:val="left"/>
-            </w:pPr>
+            <w:tcW w:type="dxa" w:w="5860"/>
+            <w:tcMar>
+              <w:top w:type="dxa" w:w="80"/>
+              <w:left w:type="dxa" w:w="100"/>
+              <w:bottom w:type="dxa" w:w="80"/>
+              <w:right w:type="dxa" w:w="100"/>
+            </w:tcMar>
+          </w:tcPr>
+          <w:p>
             <w:r>
               <w:rPr>
                 <w:b w:val="false"/>
@@ -1087,18 +1090,15 @@
       <w:tr>
         <w:tc>
           <w:tcPr>
-            <w:tcW w:type="dxa" w:w="3600"/>
-            <w:tcMar>
-              <w:top w:type="dxa" w:w="80"/>
-              <w:left w:type="dxa" w:w="100"/>
-              <w:bottom w:type="dxa" w:w="80"/>
-              <w:right w:type="dxa" w:w="100"/>
-            </w:tcMar>
-          </w:tcPr>
-          <w:p>
-            <w:pPr>
-              <w:jc w:val="left"/>
-            </w:pPr>
+            <w:tcW w:type="dxa" w:w="2600"/>
+            <w:tcMar>
+              <w:top w:type="dxa" w:w="80"/>
+              <w:left w:type="dxa" w:w="100"/>
+              <w:bottom w:type="dxa" w:w="80"/>
+              <w:right w:type="dxa" w:w="100"/>
+            </w:tcMar>
+          </w:tcPr>
+          <w:p>
             <w:r>
               <w:rPr>
                 <w:b w:val="false"/>
@@ -1112,18 +1112,15 @@
         </w:tc>
         <w:tc>
           <w:tcPr>
-            <w:tcW w:type="dxa" w:w="1900"/>
-            <w:tcMar>
-              <w:top w:type="dxa" w:w="80"/>
-              <w:left w:type="dxa" w:w="100"/>
-              <w:bottom w:type="dxa" w:w="80"/>
-              <w:right w:type="dxa" w:w="100"/>
-            </w:tcMar>
-          </w:tcPr>
-          <w:p>
-            <w:pPr>
-              <w:jc w:val="center"/>
-            </w:pPr>
+            <w:tcW w:type="dxa" w:w="1500"/>
+            <w:tcMar>
+              <w:top w:type="dxa" w:w="80"/>
+              <w:left w:type="dxa" w:w="100"/>
+              <w:bottom w:type="dxa" w:w="80"/>
+              <w:right w:type="dxa" w:w="100"/>
+            </w:tcMar>
+          </w:tcPr>
+          <w:p>
             <w:r>
               <w:rPr>
                 <w:b w:val="false"/>
@@ -1137,26 +1134,23 @@
         </w:tc>
         <w:tc>
           <w:tcPr>
-            <w:tcW w:type="dxa" w:w="4500"/>
-            <w:tcMar>
-              <w:top w:type="dxa" w:w="80"/>
-              <w:left w:type="dxa" w:w="100"/>
-              <w:bottom w:type="dxa" w:w="80"/>
-              <w:right w:type="dxa" w:w="100"/>
-            </w:tcMar>
-          </w:tcPr>
-          <w:p>
-            <w:pPr>
-              <w:jc w:val="left"/>
-            </w:pPr>
-            <w:r>
-              <w:rPr>
-                <w:b w:val="false"/>
-                <w:bCs w:val="false"/>
-                <w:sz w:val="20"/>
-                <w:szCs w:val="20"/>
-              </w:rPr>
-              <w:t xml:space="preserve">Ya está terminado del lado Django (ver documento aparte); falta portarlo acá.</w:t>
+            <w:tcW w:type="dxa" w:w="5860"/>
+            <w:tcMar>
+              <w:top w:type="dxa" w:w="80"/>
+              <w:left w:type="dxa" w:w="100"/>
+              <w:bottom w:type="dxa" w:w="80"/>
+              <w:right w:type="dxa" w:w="100"/>
+            </w:tcMar>
+          </w:tcPr>
+          <w:p>
+            <w:r>
+              <w:rPr>
+                <w:b w:val="false"/>
+                <w:bCs w:val="false"/>
+                <w:sz w:val="20"/>
+                <w:szCs w:val="20"/>
+              </w:rPr>
+              <w:t xml:space="preserve">Ya está terminado del lado Django; falta portarlo acá.</w:t>
             </w:r>
           </w:p>
         </w:tc>
@@ -1164,19 +1158,15 @@
       <w:tr>
         <w:tc>
           <w:tcPr>
-            <w:tcW w:type="dxa" w:w="3600"/>
-            <w:shd w:fill="F7F9FC" w:val="clear"/>
-            <w:tcMar>
-              <w:top w:type="dxa" w:w="80"/>
-              <w:left w:type="dxa" w:w="100"/>
-              <w:bottom w:type="dxa" w:w="80"/>
-              <w:right w:type="dxa" w:w="100"/>
-            </w:tcMar>
-          </w:tcPr>
-          <w:p>
-            <w:pPr>
-              <w:jc w:val="left"/>
-            </w:pPr>
+            <w:tcW w:type="dxa" w:w="2600"/>
+            <w:tcMar>
+              <w:top w:type="dxa" w:w="80"/>
+              <w:left w:type="dxa" w:w="100"/>
+              <w:bottom w:type="dxa" w:w="80"/>
+              <w:right w:type="dxa" w:w="100"/>
+            </w:tcMar>
+          </w:tcPr>
+          <w:p>
             <w:r>
               <w:rPr>
                 <w:b w:val="false"/>
@@ -1190,19 +1180,15 @@
         </w:tc>
         <w:tc>
           <w:tcPr>
-            <w:tcW w:type="dxa" w:w="1900"/>
-            <w:shd w:fill="F7F9FC" w:val="clear"/>
-            <w:tcMar>
-              <w:top w:type="dxa" w:w="80"/>
-              <w:left w:type="dxa" w:w="100"/>
-              <w:bottom w:type="dxa" w:w="80"/>
-              <w:right w:type="dxa" w:w="100"/>
-            </w:tcMar>
-          </w:tcPr>
-          <w:p>
-            <w:pPr>
-              <w:jc w:val="center"/>
-            </w:pPr>
+            <w:tcW w:type="dxa" w:w="1500"/>
+            <w:tcMar>
+              <w:top w:type="dxa" w:w="80"/>
+              <w:left w:type="dxa" w:w="100"/>
+              <w:bottom w:type="dxa" w:w="80"/>
+              <w:right w:type="dxa" w:w="100"/>
+            </w:tcMar>
+          </w:tcPr>
+          <w:p>
             <w:r>
               <w:rPr>
                 <w:b w:val="false"/>
@@ -1216,19 +1202,15 @@
         </w:tc>
         <w:tc>
           <w:tcPr>
-            <w:tcW w:type="dxa" w:w="4500"/>
-            <w:shd w:fill="F7F9FC" w:val="clear"/>
-            <w:tcMar>
-              <w:top w:type="dxa" w:w="80"/>
-              <w:left w:type="dxa" w:w="100"/>
-              <w:bottom w:type="dxa" w:w="80"/>
-              <w:right w:type="dxa" w:w="100"/>
-            </w:tcMar>
-          </w:tcPr>
-          <w:p>
-            <w:pPr>
-              <w:jc w:val="left"/>
-            </w:pPr>
+            <w:tcW w:type="dxa" w:w="5860"/>
+            <w:tcMar>
+              <w:top w:type="dxa" w:w="80"/>
+              <w:left w:type="dxa" w:w="100"/>
+              <w:bottom w:type="dxa" w:w="80"/>
+              <w:right w:type="dxa" w:w="100"/>
+            </w:tcMar>
+          </w:tcPr>
+          <w:p>
             <w:r>
               <w:rPr>
                 <w:b w:val="false"/>
@@ -1244,18 +1226,15 @@
       <w:tr>
         <w:tc>
           <w:tcPr>
-            <w:tcW w:type="dxa" w:w="3600"/>
-            <w:tcMar>
-              <w:top w:type="dxa" w:w="80"/>
-              <w:left w:type="dxa" w:w="100"/>
-              <w:bottom w:type="dxa" w:w="80"/>
-              <w:right w:type="dxa" w:w="100"/>
-            </w:tcMar>
-          </w:tcPr>
-          <w:p>
-            <w:pPr>
-              <w:jc w:val="left"/>
-            </w:pPr>
+            <w:tcW w:type="dxa" w:w="2600"/>
+            <w:tcMar>
+              <w:top w:type="dxa" w:w="80"/>
+              <w:left w:type="dxa" w:w="100"/>
+              <w:bottom w:type="dxa" w:w="80"/>
+              <w:right w:type="dxa" w:w="100"/>
+            </w:tcMar>
+          </w:tcPr>
+          <w:p>
             <w:r>
               <w:rPr>
                 <w:b w:val="false"/>
@@ -1269,18 +1248,15 @@
         </w:tc>
         <w:tc>
           <w:tcPr>
-            <w:tcW w:type="dxa" w:w="1900"/>
-            <w:tcMar>
-              <w:top w:type="dxa" w:w="80"/>
-              <w:left w:type="dxa" w:w="100"/>
-              <w:bottom w:type="dxa" w:w="80"/>
-              <w:right w:type="dxa" w:w="100"/>
-            </w:tcMar>
-          </w:tcPr>
-          <w:p>
-            <w:pPr>
-              <w:jc w:val="center"/>
-            </w:pPr>
+            <w:tcW w:type="dxa" w:w="1500"/>
+            <w:tcMar>
+              <w:top w:type="dxa" w:w="80"/>
+              <w:left w:type="dxa" w:w="100"/>
+              <w:bottom w:type="dxa" w:w="80"/>
+              <w:right w:type="dxa" w:w="100"/>
+            </w:tcMar>
+          </w:tcPr>
+          <w:p>
             <w:r>
               <w:rPr>
                 <w:b w:val="false"/>
@@ -1294,18 +1270,15 @@
         </w:tc>
         <w:tc>
           <w:tcPr>
-            <w:tcW w:type="dxa" w:w="4500"/>
-            <w:tcMar>
-              <w:top w:type="dxa" w:w="80"/>
-              <w:left w:type="dxa" w:w="100"/>
-              <w:bottom w:type="dxa" w:w="80"/>
-              <w:right w:type="dxa" w:w="100"/>
-            </w:tcMar>
-          </w:tcPr>
-          <w:p>
-            <w:pPr>
-              <w:jc w:val="left"/>
-            </w:pPr>
+            <w:tcW w:type="dxa" w:w="5860"/>
+            <w:tcMar>
+              <w:top w:type="dxa" w:w="80"/>
+              <w:left w:type="dxa" w:w="100"/>
+              <w:bottom w:type="dxa" w:w="80"/>
+              <w:right w:type="dxa" w:w="100"/>
+            </w:tcMar>
+          </w:tcPr>
+          <w:p>
             <w:r>
               <w:rPr>
                 <w:b w:val="false"/>
@@ -1321,19 +1294,15 @@
       <w:tr>
         <w:tc>
           <w:tcPr>
-            <w:tcW w:type="dxa" w:w="3600"/>
-            <w:shd w:fill="F7F9FC" w:val="clear"/>
-            <w:tcMar>
-              <w:top w:type="dxa" w:w="80"/>
-              <w:left w:type="dxa" w:w="100"/>
-              <w:bottom w:type="dxa" w:w="80"/>
-              <w:right w:type="dxa" w:w="100"/>
-            </w:tcMar>
-          </w:tcPr>
-          <w:p>
-            <w:pPr>
-              <w:jc w:val="left"/>
-            </w:pPr>
+            <w:tcW w:type="dxa" w:w="2600"/>
+            <w:tcMar>
+              <w:top w:type="dxa" w:w="80"/>
+              <w:left w:type="dxa" w:w="100"/>
+              <w:bottom w:type="dxa" w:w="80"/>
+              <w:right w:type="dxa" w:w="100"/>
+            </w:tcMar>
+          </w:tcPr>
+          <w:p>
             <w:r>
               <w:rPr>
                 <w:b w:val="false"/>
@@ -1347,19 +1316,15 @@
         </w:tc>
         <w:tc>
           <w:tcPr>
-            <w:tcW w:type="dxa" w:w="1900"/>
-            <w:shd w:fill="F7F9FC" w:val="clear"/>
-            <w:tcMar>
-              <w:top w:type="dxa" w:w="80"/>
-              <w:left w:type="dxa" w:w="100"/>
-              <w:bottom w:type="dxa" w:w="80"/>
-              <w:right w:type="dxa" w:w="100"/>
-            </w:tcMar>
-          </w:tcPr>
-          <w:p>
-            <w:pPr>
-              <w:jc w:val="center"/>
-            </w:pPr>
+            <w:tcW w:type="dxa" w:w="1500"/>
+            <w:tcMar>
+              <w:top w:type="dxa" w:w="80"/>
+              <w:left w:type="dxa" w:w="100"/>
+              <w:bottom w:type="dxa" w:w="80"/>
+              <w:right w:type="dxa" w:w="100"/>
+            </w:tcMar>
+          </w:tcPr>
+          <w:p>
             <w:r>
               <w:rPr>
                 <w:b w:val="false"/>
@@ -1373,19 +1338,15 @@
         </w:tc>
         <w:tc>
           <w:tcPr>
-            <w:tcW w:type="dxa" w:w="4500"/>
-            <w:shd w:fill="F7F9FC" w:val="clear"/>
-            <w:tcMar>
-              <w:top w:type="dxa" w:w="80"/>
-              <w:left w:type="dxa" w:w="100"/>
-              <w:bottom w:type="dxa" w:w="80"/>
-              <w:right w:type="dxa" w:w="100"/>
-            </w:tcMar>
-          </w:tcPr>
-          <w:p>
-            <w:pPr>
-              <w:jc w:val="left"/>
-            </w:pPr>
+            <w:tcW w:type="dxa" w:w="5860"/>
+            <w:tcMar>
+              <w:top w:type="dxa" w:w="80"/>
+              <w:left w:type="dxa" w:w="100"/>
+              <w:bottom w:type="dxa" w:w="80"/>
+              <w:right w:type="dxa" w:w="100"/>
+            </w:tcMar>
+          </w:tcPr>
+          <w:p>
             <w:r>
               <w:rPr>
                 <w:b w:val="false"/>
@@ -1401,18 +1362,15 @@
       <w:tr>
         <w:tc>
           <w:tcPr>
-            <w:tcW w:type="dxa" w:w="3600"/>
-            <w:tcMar>
-              <w:top w:type="dxa" w:w="80"/>
-              <w:left w:type="dxa" w:w="100"/>
-              <w:bottom w:type="dxa" w:w="80"/>
-              <w:right w:type="dxa" w:w="100"/>
-            </w:tcMar>
-          </w:tcPr>
-          <w:p>
-            <w:pPr>
-              <w:jc w:val="left"/>
-            </w:pPr>
+            <w:tcW w:type="dxa" w:w="2600"/>
+            <w:tcMar>
+              <w:top w:type="dxa" w:w="80"/>
+              <w:left w:type="dxa" w:w="100"/>
+              <w:bottom w:type="dxa" w:w="80"/>
+              <w:right w:type="dxa" w:w="100"/>
+            </w:tcMar>
+          </w:tcPr>
+          <w:p>
             <w:r>
               <w:rPr>
                 <w:b w:val="false"/>
@@ -1426,18 +1384,15 @@
         </w:tc>
         <w:tc>
           <w:tcPr>
-            <w:tcW w:type="dxa" w:w="1900"/>
-            <w:tcMar>
-              <w:top w:type="dxa" w:w="80"/>
-              <w:left w:type="dxa" w:w="100"/>
-              <w:bottom w:type="dxa" w:w="80"/>
-              <w:right w:type="dxa" w:w="100"/>
-            </w:tcMar>
-          </w:tcPr>
-          <w:p>
-            <w:pPr>
-              <w:jc w:val="center"/>
-            </w:pPr>
+            <w:tcW w:type="dxa" w:w="1500"/>
+            <w:tcMar>
+              <w:top w:type="dxa" w:w="80"/>
+              <w:left w:type="dxa" w:w="100"/>
+              <w:bottom w:type="dxa" w:w="80"/>
+              <w:right w:type="dxa" w:w="100"/>
+            </w:tcMar>
+          </w:tcPr>
+          <w:p>
             <w:r>
               <w:rPr>
                 <w:b w:val="false"/>
@@ -1451,18 +1406,15 @@
         </w:tc>
         <w:tc>
           <w:tcPr>
-            <w:tcW w:type="dxa" w:w="4500"/>
-            <w:tcMar>
-              <w:top w:type="dxa" w:w="80"/>
-              <w:left w:type="dxa" w:w="100"/>
-              <w:bottom w:type="dxa" w:w="80"/>
-              <w:right w:type="dxa" w:w="100"/>
-            </w:tcMar>
-          </w:tcPr>
-          <w:p>
-            <w:pPr>
-              <w:jc w:val="left"/>
-            </w:pPr>
+            <w:tcW w:type="dxa" w:w="5860"/>
+            <w:tcMar>
+              <w:top w:type="dxa" w:w="80"/>
+              <w:left w:type="dxa" w:w="100"/>
+              <w:bottom w:type="dxa" w:w="80"/>
+              <w:right w:type="dxa" w:w="100"/>
+            </w:tcMar>
+          </w:tcPr>
+          <w:p>
             <w:r>
               <w:rPr>
                 <w:b w:val="false"/>
@@ -1478,17 +1430,22 @@
     </w:tbl>
     <w:p>
       <w:pPr>
+        <w:spacing w:after="240"/>
+      </w:pPr>
+    </w:p>
+    <w:p>
+      <w:pPr>
         <w:pStyle w:val="Heading1"/>
-        <w:spacing w:after="160" w:before="320"/>
-      </w:pPr>
-      <w:r>
-        <w:t xml:space="preserve">5. Módulos terminados</w:t>
+        <w:spacing w:after="160" w:before="360"/>
+      </w:pPr>
+      <w:r>
+        <w:t xml:space="preserve">5. Módulos terminados / en curso</w:t>
       </w:r>
     </w:p>
     <w:p>
       <w:pPr>
         <w:pStyle w:val="Heading2"/>
-        <w:spacing w:after="120" w:before="260"/>
+        <w:spacing w:after="120" w:before="280"/>
       </w:pPr>
       <w:r>
         <w:t xml:space="preserve">5.1 Entidades</w:t>
@@ -1499,9 +1456,9 @@
         <w:pStyle w:val="ListParagraph"/>
         <w:numPr>
           <w:ilvl w:val="0"/>
-          <w:numId w:val="2"/>
-        </w:numPr>
-        <w:spacing w:after="90"/>
+          <w:numId w:val="1"/>
+        </w:numPr>
+        <w:spacing w:after="80"/>
       </w:pPr>
       <w:r>
         <w:t xml:space="preserve">Listado con búsqueda por nombre o CUIT, y checkbox para mostrar también las inactivas.</w:t>
@@ -1512,9 +1469,9 @@
         <w:pStyle w:val="ListParagraph"/>
         <w:numPr>
           <w:ilvl w:val="0"/>
-          <w:numId w:val="2"/>
-        </w:numPr>
-        <w:spacing w:after="90"/>
+          <w:numId w:val="1"/>
+        </w:numPr>
+        <w:spacing w:after="80"/>
       </w:pPr>
       <w:r>
         <w:t xml:space="preserve">Alta y edición con todos los campos: nombre, CUIT, dirección, documento N°, código, localidad, código postal, IVA, provincia.</w:t>
@@ -1525,9 +1482,9 @@
         <w:pStyle w:val="ListParagraph"/>
         <w:numPr>
           <w:ilvl w:val="0"/>
-          <w:numId w:val="2"/>
-        </w:numPr>
-        <w:spacing w:after="90"/>
+          <w:numId w:val="1"/>
+        </w:numPr>
+        <w:spacing w:after="80"/>
       </w:pPr>
       <w:r>
         <w:t xml:space="preserve">Dar de baja / reactivar (nunca elimina, ver decisiones de diseño).</w:t>
@@ -1538,9 +1495,9 @@
         <w:pStyle w:val="ListParagraph"/>
         <w:numPr>
           <w:ilvl w:val="0"/>
-          <w:numId w:val="2"/>
-        </w:numPr>
-        <w:spacing w:after="90"/>
+          <w:numId w:val="1"/>
+        </w:numPr>
+        <w:spacing w:after="80"/>
       </w:pPr>
       <w:r>
         <w:t xml:space="preserve">Doble clic en una fila abre la edición directamente.</w:t>
@@ -1549,7 +1506,7 @@
     <w:p>
       <w:pPr>
         <w:pStyle w:val="Heading2"/>
-        <w:spacing w:after="120" w:before="260"/>
+        <w:spacing w:after="120" w:before="280"/>
       </w:pPr>
       <w:r>
         <w:t xml:space="preserve">5.2 Productos</w:t>
@@ -1560,9 +1517,9 @@
         <w:pStyle w:val="ListParagraph"/>
         <w:numPr>
           <w:ilvl w:val="0"/>
-          <w:numId w:val="2"/>
-        </w:numPr>
-        <w:spacing w:after="90"/>
+          <w:numId w:val="1"/>
+        </w:numPr>
+        <w:spacing w:after="80"/>
       </w:pPr>
       <w:r>
         <w:t xml:space="preserve">Listado con búsqueda por nombre, mostrando también el tipo de ítem (Producto, Servicio, etc.).</w:t>
@@ -1573,9 +1530,9 @@
         <w:pStyle w:val="ListParagraph"/>
         <w:numPr>
           <w:ilvl w:val="0"/>
-          <w:numId w:val="2"/>
-        </w:numPr>
-        <w:spacing w:after="90"/>
+          <w:numId w:val="1"/>
+        </w:numPr>
+        <w:spacing w:after="80"/>
       </w:pPr>
       <w:r>
         <w:t xml:space="preserve">Alta y edición: nombre + tipo (combo desplegable con los item_tipo existentes).</w:t>
@@ -1586,9 +1543,9 @@
         <w:pStyle w:val="ListParagraph"/>
         <w:numPr>
           <w:ilvl w:val="0"/>
-          <w:numId w:val="2"/>
-        </w:numPr>
-        <w:spacing w:after="90"/>
+          <w:numId w:val="1"/>
+        </w:numPr>
+        <w:spacing w:after="80"/>
       </w:pPr>
       <w:r>
         <w:t xml:space="preserve">Eliminar, bloqueado si el producto está en uso.</w:t>
@@ -1596,8 +1553,169 @@
     </w:p>
     <w:p>
       <w:pPr>
+        <w:pStyle w:val="Heading2"/>
+        <w:spacing w:after="120" w:before="280"/>
+      </w:pPr>
+      <w:r>
+        <w:t xml:space="preserve">5.3 Movimientos</w:t>
+      </w:r>
+    </w:p>
+    <w:p>
+      <w:pPr>
+        <w:pStyle w:val="ListParagraph"/>
+        <w:numPr>
+          <w:ilvl w:val="0"/>
+          <w:numId w:val="1"/>
+        </w:numPr>
+        <w:spacing w:after="80"/>
+      </w:pPr>
+      <w:r>
+        <w:t xml:space="preserve">Listado/búsqueda con los mismos 4 filtros que la web: receptor, ID, fecha y N°.</w:t>
+      </w:r>
+    </w:p>
+    <w:p>
+      <w:pPr>
+        <w:pStyle w:val="ListParagraph"/>
+        <w:numPr>
+          <w:ilvl w:val="0"/>
+          <w:numId w:val="1"/>
+        </w:numPr>
+        <w:spacing w:after="80"/>
+      </w:pPr>
+      <w:r>
+        <w:t xml:space="preserve">Alta y edición genérica: fecha, N°, entidad emisora, entidad receptora, total, unidad de medida y producto.</w:t>
+      </w:r>
+    </w:p>
+    <w:p>
+      <w:pPr>
+        <w:pStyle w:val="ListParagraph"/>
+        <w:numPr>
+          <w:ilvl w:val="0"/>
+          <w:numId w:val="1"/>
+        </w:numPr>
+        <w:spacing w:after="80"/>
+      </w:pPr>
+      <w:r>
+        <w:t xml:space="preserve">Recepción de H.V. de Yerba Mate: producto y unidad fijos, receptor fijo (Fontana Secadero), se elige el operador INYM emisor, se cargan bruto/tara/descuento y el total se calcula solo; N°/fecha se precargan con el último + 1.</w:t>
+      </w:r>
+    </w:p>
+    <w:p>
+      <w:pPr>
+        <w:pStyle w:val="ListParagraph"/>
+        <w:numPr>
+          <w:ilvl w:val="0"/>
+          <w:numId w:val="1"/>
+        </w:numPr>
+        <w:spacing w:after="80"/>
+      </w:pPr>
+      <w:r>
+        <w:t xml:space="preserve">Salida de Yerba Mate Canchada: mismo mecanismo al revés (emisor fijo Fontana Secadero, se elige el operador INYM receptor).</w:t>
+      </w:r>
+    </w:p>
+    <w:p>
+      <w:pPr>
+        <w:pStyle w:val="ListParagraph"/>
+        <w:numPr>
+          <w:ilvl w:val="0"/>
+          <w:numId w:val="1"/>
+        </w:numPr>
+        <w:spacing w:after="80"/>
+      </w:pPr>
+      <w:r>
+        <w:t xml:space="preserve">Salida genérica: un movimiento de salida simple (fecha, producto, entidad receptora, N°, total), sin operadores INYM ni pesaje; el emisor es siempre Fontana y el total se carga directo.</w:t>
+      </w:r>
+    </w:p>
+    <w:p>
+      <w:pPr>
+        <w:pStyle w:val="ListParagraph"/>
+        <w:numPr>
+          <w:ilvl w:val="0"/>
+          <w:numId w:val="1"/>
+        </w:numPr>
+        <w:spacing w:after="80"/>
+      </w:pPr>
+      <w:r>
+        <w:t xml:space="preserve">Ranking de Productores: agrupa por entidad emisora sumando el total entregado y contando entregas, con % de participación, filtro de rango de fecha y de producto, y exportación a Excel y PDF.</w:t>
+      </w:r>
+    </w:p>
+    <w:p>
+      <w:pPr>
+        <w:pStyle w:val="ListParagraph"/>
+        <w:numPr>
+          <w:ilvl w:val="0"/>
+          <w:numId w:val="1"/>
+        </w:numPr>
+        <w:spacing w:after="80"/>
+      </w:pPr>
+      <w:r>
+        <w:t xml:space="preserve">Eliminar: intenta el DELETE directo y avisa si la base lo rechaza por integridad (ver decisiones de diseño).</w:t>
+      </w:r>
+    </w:p>
+    <w:p>
+      <w:pPr>
+        <w:pStyle w:val="Heading2"/>
+        <w:spacing w:after="120" w:before="280"/>
+      </w:pPr>
+      <w:r>
+        <w:t xml:space="preserve">5.4 Comprobantes (cabecera)</w:t>
+      </w:r>
+    </w:p>
+    <w:p>
+      <w:pPr>
+        <w:pStyle w:val="ListParagraph"/>
+        <w:numPr>
+          <w:ilvl w:val="0"/>
+          <w:numId w:val="1"/>
+        </w:numPr>
+        <w:spacing w:after="80"/>
+      </w:pPr>
+      <w:r>
+        <w:t xml:space="preserve">Listado/búsqueda por entidad, ID y fecha, más el checkbox "Sin renglones cargados"; muestra también la cantidad de renglones de cada uno.</w:t>
+      </w:r>
+    </w:p>
+    <w:p>
+      <w:pPr>
+        <w:pStyle w:val="ListParagraph"/>
+        <w:numPr>
+          <w:ilvl w:val="0"/>
+          <w:numId w:val="1"/>
+        </w:numPr>
+        <w:spacing w:after="80"/>
+      </w:pPr>
+      <w:r>
+        <w:t xml:space="preserve">Alta y edición de los 17 campos de la cabecera: entidad emisora, tipo de comprobante, tipo de documento, fecha, punto de venta, N°, moneda, neto gravado, neto no gravado, recargo, impuesto, IVA, exento, otros tributos, total, detalle y "es emisor" (rol respecto de Fontana).</w:t>
+      </w:r>
+    </w:p>
+    <w:p>
+      <w:pPr>
+        <w:pStyle w:val="ListParagraph"/>
+        <w:numPr>
+          <w:ilvl w:val="0"/>
+          <w:numId w:val="1"/>
+        </w:numPr>
+        <w:spacing w:after="80"/>
+      </w:pPr>
+      <w:r>
+        <w:t xml:space="preserve">Eliminar: borra a mano los renglones y el tipo de cambio asociados antes que la cabecera, para replicar el mismo efecto en cascada que tiene Django (ver decisiones de diseño).</w:t>
+      </w:r>
+    </w:p>
+    <w:p>
+      <w:pPr>
+        <w:pStyle w:val="ListParagraph"/>
+        <w:numPr>
+          <w:ilvl w:val="0"/>
+          <w:numId w:val="1"/>
+        </w:numPr>
+        <w:spacing w:after="80"/>
+      </w:pPr>
+      <w:r>
+        <w:t xml:space="preserve">Pendiente para una próxima vuelta: renglones de comprobante (cantidad/precio/IVA/unidad), tipo de cambio para moneda extranjera, y los reportes/rankings/exportaciones propios de este módulo.</w:t>
+      </w:r>
+    </w:p>
+    <w:p>
+      <w:pPr>
         <w:pStyle w:val="Heading1"/>
-        <w:spacing w:after="160" w:before="320"/>
+        <w:spacing w:after="160" w:before="360"/>
       </w:pPr>
       <w:r>
         <w:t xml:space="preserve">6. Instalación y uso</w:t>
@@ -1608,73 +1726,70 @@
         <w:spacing w:after="160"/>
       </w:pPr>
       <w:r>
-        <w:t xml:space="preserve">Requisitos: Python 3 con Tkinter (incluido en la instalación estándar de Windows) y las dependencias del archivo requirements.txt.</w:t>
-      </w:r>
-    </w:p>
-    <w:p>
-      <w:pPr>
-        <w:pBdr>
-          <w:top w:val="single" w:color="CCCCCC" w:sz="2"/>
-          <w:bottom w:val="single" w:color="CCCCCC" w:sz="2"/>
-          <w:left w:val="single" w:color="CCCCCC" w:sz="2"/>
-          <w:right w:val="single" w:color="CCCCCC" w:sz="2"/>
-        </w:pBdr>
-        <w:shd w:fill="F2F2F2" w:val="clear"/>
-        <w:spacing w:after="200" w:before="80"/>
+        <w:t xml:space="preserve">Requisitos: Python 3 con Tkinter (incluido en la instalación estándar de Windows) y las dependencias del archivo requirements.txt (PyMySQL, python-dotenv, openpyxl y reportlab -- estas dos últimas se sumaron para la exportación a Excel/PDF de Movimientos).</w:t>
+      </w:r>
+    </w:p>
+    <w:p>
+      <w:pPr>
+        <w:spacing w:after="40"/>
       </w:pPr>
       <w:r>
         <w:rPr>
           <w:rFonts w:ascii="Consolas" w:cs="Consolas" w:eastAsia="Consolas" w:hAnsi="Consolas"/>
-          <w:sz w:val="18"/>
-          <w:szCs w:val="18"/>
+          <w:sz w:val="20"/>
+          <w:szCs w:val="20"/>
         </w:rPr>
         <w:t xml:space="preserve">cd fontana_escritorio</w:t>
       </w:r>
-      <w:r>
-        <w:br/>
-        <w:t xml:space="preserve"/>
-      </w:r>
+    </w:p>
+    <w:p>
+      <w:pPr>
+        <w:spacing w:after="40"/>
+      </w:pPr>
       <w:r>
         <w:rPr>
           <w:rFonts w:ascii="Consolas" w:cs="Consolas" w:eastAsia="Consolas" w:hAnsi="Consolas"/>
-          <w:sz w:val="18"/>
-          <w:szCs w:val="18"/>
+          <w:sz w:val="20"/>
+          <w:szCs w:val="20"/>
         </w:rPr>
         <w:t xml:space="preserve">pip install -r requirements.txt</w:t>
       </w:r>
-      <w:r>
-        <w:br/>
-        <w:t xml:space="preserve"/>
-      </w:r>
+    </w:p>
+    <w:p>
+      <w:pPr>
+        <w:spacing w:after="40"/>
+      </w:pPr>
       <w:r>
         <w:rPr>
           <w:rFonts w:ascii="Consolas" w:cs="Consolas" w:eastAsia="Consolas" w:hAnsi="Consolas"/>
-          <w:sz w:val="18"/>
-          <w:szCs w:val="18"/>
+          <w:sz w:val="20"/>
+          <w:szCs w:val="20"/>
         </w:rPr>
         <w:t xml:space="preserve">copy .env.example .env</w:t>
       </w:r>
-      <w:r>
-        <w:br/>
-        <w:t xml:space="preserve"/>
-      </w:r>
+    </w:p>
+    <w:p>
+      <w:pPr>
+        <w:spacing w:after="40"/>
+      </w:pPr>
       <w:r>
         <w:rPr>
           <w:rFonts w:ascii="Consolas" w:cs="Consolas" w:eastAsia="Consolas" w:hAnsi="Consolas"/>
-          <w:sz w:val="18"/>
-          <w:szCs w:val="18"/>
-        </w:rPr>
-        <w:t xml:space="preserve">   (completar .env con los mismos datos que fontana_movimientos\.env)</w:t>
-      </w:r>
-      <w:r>
-        <w:br/>
-        <w:t xml:space="preserve"/>
-      </w:r>
+          <w:sz w:val="20"/>
+          <w:szCs w:val="20"/>
+        </w:rPr>
+        <w:t xml:space="preserve">(completar .env con los mismos datos que fontana_movimientos\.env)</w:t>
+      </w:r>
+    </w:p>
+    <w:p>
+      <w:pPr>
+        <w:spacing w:after="40"/>
+      </w:pPr>
       <w:r>
         <w:rPr>
           <w:rFonts w:ascii="Consolas" w:cs="Consolas" w:eastAsia="Consolas" w:hAnsi="Consolas"/>
-          <w:sz w:val="18"/>
-          <w:szCs w:val="18"/>
+          <w:sz w:val="20"/>
+          <w:szCs w:val="20"/>
         </w:rPr>
         <w:t xml:space="preserve">python app.py</w:t>
       </w:r>
@@ -1683,6 +1798,11 @@
       <w:pPr>
         <w:spacing w:after="160"/>
       </w:pPr>
+    </w:p>
+    <w:p>
+      <w:pPr>
+        <w:spacing w:after="160"/>
+      </w:pPr>
       <w:r>
         <w:t xml:space="preserve">El archivo .env no se genera automáticamente a partir del de Django por seguridad (para no manipular la contraseña real desde afuera) -- alcanza con copiar el archivo existente a esta carpeta.</w:t>
       </w:r>
@@ -1690,7 +1810,7 @@
     <w:p>
       <w:pPr>
         <w:pStyle w:val="Heading1"/>
-        <w:spacing w:after="160" w:before="320"/>
+        <w:spacing w:after="160" w:before="360"/>
       </w:pPr>
       <w:r>
         <w:t xml:space="preserve">7. Cómo se probó</w:t>
@@ -1706,8 +1826,16 @@
     </w:p>
     <w:p>
       <w:pPr>
+        <w:spacing w:after="160"/>
+      </w:pPr>
+      <w:r>
+        <w:t xml:space="preserve">Para Movimientos y Comprobantes se siguió otro camino de verificación, sin correr la interfaz gráfica esta vez: antes de escribir cada pieza se revisó el código Django real (views.py / forms.py / models.py del app correspondiente) para copiar la misma lógica de negocio en vez de inventarla; después, cada función de repository.py (armado de SQL, cálculo de ranking, alta con id manual, borrado en cascada) se ejecutó con una conexión MySQL simulada -- sin tocar la base de producción -- para confirmar que no tira errores y devuelve lo esperado; y por último se compiló (py_compile) y se revisó la estructura (AST) de todos los archivos del proyecto. Las funciones de exportación de reportes.py también se probaron generando un Excel y un PDF de ejemplo con datos ficticios.</w:t>
+      </w:r>
+    </w:p>
+    <w:p>
+      <w:pPr>
         <w:pStyle w:val="Heading1"/>
-        <w:spacing w:after="160" w:before="320"/>
+        <w:spacing w:after="160" w:before="360"/>
       </w:pPr>
       <w:r>
         <w:t xml:space="preserve">8. Estructura de carpetas</w:t>
@@ -1715,148 +1843,247 @@
     </w:p>
     <w:p>
       <w:pPr>
-        <w:pBdr>
-          <w:top w:val="single" w:color="CCCCCC" w:sz="2"/>
-          <w:bottom w:val="single" w:color="CCCCCC" w:sz="2"/>
-          <w:left w:val="single" w:color="CCCCCC" w:sz="2"/>
-          <w:right w:val="single" w:color="CCCCCC" w:sz="2"/>
-        </w:pBdr>
-        <w:shd w:fill="F2F2F2" w:val="clear"/>
-        <w:spacing w:after="200" w:before="80"/>
+        <w:spacing w:after="40"/>
       </w:pPr>
       <w:r>
         <w:rPr>
           <w:rFonts w:ascii="Consolas" w:cs="Consolas" w:eastAsia="Consolas" w:hAnsi="Consolas"/>
-          <w:sz w:val="18"/>
-          <w:szCs w:val="18"/>
+          <w:sz w:val="20"/>
+          <w:szCs w:val="20"/>
         </w:rPr>
         <w:t xml:space="preserve">fontana_escritorio/</w:t>
       </w:r>
-      <w:r>
-        <w:br/>
-        <w:t xml:space="preserve"/>
-      </w:r>
+    </w:p>
+    <w:p>
+      <w:pPr>
+        <w:spacing w:after="40"/>
+      </w:pPr>
       <w:r>
         <w:rPr>
           <w:rFonts w:ascii="Consolas" w:cs="Consolas" w:eastAsia="Consolas" w:hAnsi="Consolas"/>
-          <w:sz w:val="18"/>
-          <w:szCs w:val="18"/>
-        </w:rPr>
-        <w:t xml:space="preserve">├── app.py                  (ventana principal)</w:t>
-      </w:r>
-      <w:r>
-        <w:br/>
-        <w:t xml:space="preserve"/>
-      </w:r>
+          <w:sz w:val="20"/>
+          <w:szCs w:val="20"/>
+        </w:rPr>
+        <w:t xml:space="preserve">├── app.py                  # ventana principal</w:t>
+      </w:r>
+    </w:p>
+    <w:p>
+      <w:pPr>
+        <w:spacing w:after="40"/>
+      </w:pPr>
       <w:r>
         <w:rPr>
           <w:rFonts w:ascii="Consolas" w:cs="Consolas" w:eastAsia="Consolas" w:hAnsi="Consolas"/>
-          <w:sz w:val="18"/>
-          <w:szCs w:val="18"/>
-        </w:rPr>
-        <w:t xml:space="preserve">├── db.py                   (conexión a MySQL, lee .env)</w:t>
-      </w:r>
-      <w:r>
-        <w:br/>
-        <w:t xml:space="preserve"/>
-      </w:r>
+          <w:sz w:val="20"/>
+          <w:szCs w:val="20"/>
+        </w:rPr>
+        <w:t xml:space="preserve">├── db.py                   # conexión a MySQL, lee .env</w:t>
+      </w:r>
+    </w:p>
+    <w:p>
+      <w:pPr>
+        <w:spacing w:after="40"/>
+      </w:pPr>
       <w:r>
         <w:rPr>
           <w:rFonts w:ascii="Consolas" w:cs="Consolas" w:eastAsia="Consolas" w:hAnsi="Consolas"/>
-          <w:sz w:val="18"/>
-          <w:szCs w:val="18"/>
+          <w:sz w:val="20"/>
+          <w:szCs w:val="20"/>
+        </w:rPr>
+        <w:t xml:space="preserve">├── reportes.py             # exportar_excel / exportar_pdf</w:t>
+      </w:r>
+    </w:p>
+    <w:p>
+      <w:pPr>
+        <w:spacing w:after="40"/>
+      </w:pPr>
+      <w:r>
+        <w:rPr>
+          <w:rFonts w:ascii="Consolas" w:cs="Consolas" w:eastAsia="Consolas" w:hAnsi="Consolas"/>
+          <w:sz w:val="20"/>
+          <w:szCs w:val="20"/>
         </w:rPr>
         <w:t xml:space="preserve">├── requirements.txt</w:t>
       </w:r>
-      <w:r>
-        <w:br/>
-        <w:t xml:space="preserve"/>
-      </w:r>
+    </w:p>
+    <w:p>
+      <w:pPr>
+        <w:spacing w:after="40"/>
+      </w:pPr>
       <w:r>
         <w:rPr>
           <w:rFonts w:ascii="Consolas" w:cs="Consolas" w:eastAsia="Consolas" w:hAnsi="Consolas"/>
-          <w:sz w:val="18"/>
-          <w:szCs w:val="18"/>
+          <w:sz w:val="20"/>
+          <w:szCs w:val="20"/>
         </w:rPr>
         <w:t xml:space="preserve">├── .env.example</w:t>
       </w:r>
-      <w:r>
-        <w:br/>
-        <w:t xml:space="preserve"/>
-      </w:r>
+    </w:p>
+    <w:p>
+      <w:pPr>
+        <w:spacing w:after="40"/>
+      </w:pPr>
       <w:r>
         <w:rPr>
           <w:rFonts w:ascii="Consolas" w:cs="Consolas" w:eastAsia="Consolas" w:hAnsi="Consolas"/>
-          <w:sz w:val="18"/>
-          <w:szCs w:val="18"/>
+          <w:sz w:val="20"/>
+          <w:szCs w:val="20"/>
         </w:rPr>
         <w:t xml:space="preserve">├── entidades/</w:t>
       </w:r>
-      <w:r>
-        <w:br/>
-        <w:t xml:space="preserve"/>
-      </w:r>
+    </w:p>
+    <w:p>
+      <w:pPr>
+        <w:spacing w:after="40"/>
+      </w:pPr>
       <w:r>
         <w:rPr>
           <w:rFonts w:ascii="Consolas" w:cs="Consolas" w:eastAsia="Consolas" w:hAnsi="Consolas"/>
-          <w:sz w:val="18"/>
-          <w:szCs w:val="18"/>
+          <w:sz w:val="20"/>
+          <w:szCs w:val="20"/>
         </w:rPr>
         <w:t xml:space="preserve">│   ├── repository.py</w:t>
       </w:r>
-      <w:r>
-        <w:br/>
-        <w:t xml:space="preserve"/>
-      </w:r>
+    </w:p>
+    <w:p>
+      <w:pPr>
+        <w:spacing w:after="40"/>
+      </w:pPr>
       <w:r>
         <w:rPr>
           <w:rFonts w:ascii="Consolas" w:cs="Consolas" w:eastAsia="Consolas" w:hAnsi="Consolas"/>
-          <w:sz w:val="18"/>
-          <w:szCs w:val="18"/>
+          <w:sz w:val="20"/>
+          <w:szCs w:val="20"/>
         </w:rPr>
         <w:t xml:space="preserve">│   └── ui.py</w:t>
       </w:r>
-      <w:r>
-        <w:br/>
-        <w:t xml:space="preserve"/>
-      </w:r>
+    </w:p>
+    <w:p>
+      <w:pPr>
+        <w:spacing w:after="40"/>
+      </w:pPr>
       <w:r>
         <w:rPr>
           <w:rFonts w:ascii="Consolas" w:cs="Consolas" w:eastAsia="Consolas" w:hAnsi="Consolas"/>
-          <w:sz w:val="18"/>
-          <w:szCs w:val="18"/>
-        </w:rPr>
-        <w:t xml:space="preserve">└── productos/</w:t>
-      </w:r>
-      <w:r>
-        <w:br/>
-        <w:t xml:space="preserve"/>
-      </w:r>
+          <w:sz w:val="20"/>
+          <w:szCs w:val="20"/>
+        </w:rPr>
+        <w:t xml:space="preserve">├── productos/</w:t>
+      </w:r>
+    </w:p>
+    <w:p>
+      <w:pPr>
+        <w:spacing w:after="40"/>
+      </w:pPr>
       <w:r>
         <w:rPr>
           <w:rFonts w:ascii="Consolas" w:cs="Consolas" w:eastAsia="Consolas" w:hAnsi="Consolas"/>
-          <w:sz w:val="18"/>
-          <w:szCs w:val="18"/>
+          <w:sz w:val="20"/>
+          <w:szCs w:val="20"/>
+        </w:rPr>
+        <w:t xml:space="preserve">│   ├── repository.py</w:t>
+      </w:r>
+    </w:p>
+    <w:p>
+      <w:pPr>
+        <w:spacing w:after="40"/>
+      </w:pPr>
+      <w:r>
+        <w:rPr>
+          <w:rFonts w:ascii="Consolas" w:cs="Consolas" w:eastAsia="Consolas" w:hAnsi="Consolas"/>
+          <w:sz w:val="20"/>
+          <w:szCs w:val="20"/>
+        </w:rPr>
+        <w:t xml:space="preserve">│   └── ui.py</w:t>
+      </w:r>
+    </w:p>
+    <w:p>
+      <w:pPr>
+        <w:spacing w:after="40"/>
+      </w:pPr>
+      <w:r>
+        <w:rPr>
+          <w:rFonts w:ascii="Consolas" w:cs="Consolas" w:eastAsia="Consolas" w:hAnsi="Consolas"/>
+          <w:sz w:val="20"/>
+          <w:szCs w:val="20"/>
+        </w:rPr>
+        <w:t xml:space="preserve">├── movimientos/</w:t>
+      </w:r>
+    </w:p>
+    <w:p>
+      <w:pPr>
+        <w:spacing w:after="40"/>
+      </w:pPr>
+      <w:r>
+        <w:rPr>
+          <w:rFonts w:ascii="Consolas" w:cs="Consolas" w:eastAsia="Consolas" w:hAnsi="Consolas"/>
+          <w:sz w:val="20"/>
+          <w:szCs w:val="20"/>
+        </w:rPr>
+        <w:t xml:space="preserve">│   ├── repository.py</w:t>
+      </w:r>
+    </w:p>
+    <w:p>
+      <w:pPr>
+        <w:spacing w:after="40"/>
+      </w:pPr>
+      <w:r>
+        <w:rPr>
+          <w:rFonts w:ascii="Consolas" w:cs="Consolas" w:eastAsia="Consolas" w:hAnsi="Consolas"/>
+          <w:sz w:val="20"/>
+          <w:szCs w:val="20"/>
+        </w:rPr>
+        <w:t xml:space="preserve">│   └── ui.py</w:t>
+      </w:r>
+    </w:p>
+    <w:p>
+      <w:pPr>
+        <w:spacing w:after="40"/>
+      </w:pPr>
+      <w:r>
+        <w:rPr>
+          <w:rFonts w:ascii="Consolas" w:cs="Consolas" w:eastAsia="Consolas" w:hAnsi="Consolas"/>
+          <w:sz w:val="20"/>
+          <w:szCs w:val="20"/>
+        </w:rPr>
+        <w:t xml:space="preserve">└── comprobantes/</w:t>
+      </w:r>
+    </w:p>
+    <w:p>
+      <w:pPr>
+        <w:spacing w:after="40"/>
+      </w:pPr>
+      <w:r>
+        <w:rPr>
+          <w:rFonts w:ascii="Consolas" w:cs="Consolas" w:eastAsia="Consolas" w:hAnsi="Consolas"/>
+          <w:sz w:val="20"/>
+          <w:szCs w:val="20"/>
         </w:rPr>
         <w:t xml:space="preserve">    ├── repository.py</w:t>
       </w:r>
-      <w:r>
-        <w:br/>
-        <w:t xml:space="preserve"/>
-      </w:r>
+    </w:p>
+    <w:p>
+      <w:pPr>
+        <w:spacing w:after="40"/>
+      </w:pPr>
       <w:r>
         <w:rPr>
           <w:rFonts w:ascii="Consolas" w:cs="Consolas" w:eastAsia="Consolas" w:hAnsi="Consolas"/>
-          <w:sz w:val="18"/>
-          <w:szCs w:val="18"/>
+          <w:sz w:val="20"/>
+          <w:szCs w:val="20"/>
         </w:rPr>
         <w:t xml:space="preserve">    └── ui.py</w:t>
       </w:r>
     </w:p>
     <w:p>
       <w:pPr>
+        <w:spacing w:after="200"/>
+      </w:pPr>
+    </w:p>
+    <w:p>
+      <w:pPr>
         <w:pStyle w:val="Heading1"/>
-        <w:spacing w:after="160" w:before="320"/>
+        <w:spacing w:after="160" w:before="360"/>
       </w:pPr>
       <w:r>
         <w:t xml:space="preserve">9. Roadmap confirmado</w:t>
@@ -1867,56 +2094,56 @@
         <w:spacing w:after="160"/>
       </w:pPr>
       <w:r>
-        <w:t xml:space="preserve">Orden acordado para seguir agregando módulos, pensado por dependencias (Movimientos y Comprobantes necesitan los catálogos de Entidades/Productos, que ya están listos). Se puede reordenar en cualquier momento.</w:t>
-      </w:r>
-    </w:p>
-    <w:p>
-      <w:pPr>
-        <w:pStyle w:val="ListParagraph"/>
-        <w:numPr>
-          <w:ilvl w:val="0"/>
-          <w:numId w:val="2"/>
-        </w:numPr>
-        <w:spacing w:after="90"/>
-      </w:pPr>
-      <w:r>
-        <w:t xml:space="preserve">1. Movimientos -- el módulo de uso más frecuente día a día.</w:t>
-      </w:r>
-    </w:p>
-    <w:p>
-      <w:pPr>
-        <w:pStyle w:val="ListParagraph"/>
-        <w:numPr>
-          <w:ilvl w:val="0"/>
-          <w:numId w:val="2"/>
-        </w:numPr>
-        <w:spacing w:after="90"/>
-      </w:pPr>
-      <w:r>
-        <w:t xml:space="preserve">2. Comprobantes -- lo usan Liquidaciones y Cuenta Corriente de Productos.</w:t>
-      </w:r>
-    </w:p>
-    <w:p>
-      <w:pPr>
-        <w:pStyle w:val="ListParagraph"/>
-        <w:numPr>
-          <w:ilvl w:val="0"/>
-          <w:numId w:val="2"/>
-        </w:numPr>
-        <w:spacing w:after="90"/>
-      </w:pPr>
-      <w:r>
-        <w:t xml:space="preserve">3. Movimientos de Caja</w:t>
-      </w:r>
-    </w:p>
-    <w:p>
-      <w:pPr>
-        <w:pStyle w:val="ListParagraph"/>
-        <w:numPr>
-          <w:ilvl w:val="0"/>
-          <w:numId w:val="2"/>
-        </w:numPr>
-        <w:spacing w:after="90"/>
+        <w:t xml:space="preserve">Orden acordado para seguir agregando módulos, pensado por dependencias. Se puede reordenar en cualquier momento.</w:t>
+      </w:r>
+    </w:p>
+    <w:p>
+      <w:pPr>
+        <w:pStyle w:val="ListParagraph"/>
+        <w:numPr>
+          <w:ilvl w:val="0"/>
+          <w:numId w:val="1"/>
+        </w:numPr>
+        <w:spacing w:after="80"/>
+      </w:pPr>
+      <w:r>
+        <w:t xml:space="preserve">1. Movimientos -- hecho.</w:t>
+      </w:r>
+    </w:p>
+    <w:p>
+      <w:pPr>
+        <w:pStyle w:val="ListParagraph"/>
+        <w:numPr>
+          <w:ilvl w:val="0"/>
+          <w:numId w:val="1"/>
+        </w:numPr>
+        <w:spacing w:after="80"/>
+      </w:pPr>
+      <w:r>
+        <w:t xml:space="preserve">2. Comprobantes -- cabecera hecha; sigue con renglones. Lo usan Liquidaciones y Cuenta Corriente de Productos.</w:t>
+      </w:r>
+    </w:p>
+    <w:p>
+      <w:pPr>
+        <w:pStyle w:val="ListParagraph"/>
+        <w:numPr>
+          <w:ilvl w:val="0"/>
+          <w:numId w:val="1"/>
+        </w:numPr>
+        <w:spacing w:after="80"/>
+      </w:pPr>
+      <w:r>
+        <w:t xml:space="preserve">3. Movimientos de Caja -- próximo módulo a implementar.</w:t>
+      </w:r>
+    </w:p>
+    <w:p>
+      <w:pPr>
+        <w:pStyle w:val="ListParagraph"/>
+        <w:numPr>
+          <w:ilvl w:val="0"/>
+          <w:numId w:val="1"/>
+        </w:numPr>
+        <w:spacing w:after="80"/>
       </w:pPr>
       <w:r>
         <w:t xml:space="preserve">4. Retenciones + Retenciones INYM</w:t>
@@ -1927,9 +2154,9 @@
         <w:pStyle w:val="ListParagraph"/>
         <w:numPr>
           <w:ilvl w:val="0"/>
-          <w:numId w:val="2"/>
-        </w:numPr>
-        <w:spacing w:after="90"/>
+          <w:numId w:val="1"/>
+        </w:numPr>
+        <w:spacing w:after="80"/>
       </w:pPr>
       <w:r>
         <w:t xml:space="preserve">5. Liquidaciones</w:t>
@@ -1940,9 +2167,9 @@
         <w:pStyle w:val="ListParagraph"/>
         <w:numPr>
           <w:ilvl w:val="0"/>
-          <w:numId w:val="2"/>
-        </w:numPr>
-        <w:spacing w:after="90"/>
+          <w:numId w:val="1"/>
+        </w:numPr>
+        <w:spacing w:after="80"/>
       </w:pPr>
       <w:r>
         <w:t xml:space="preserve">6. Remitos</w:t>
@@ -1953,9 +2180,9 @@
         <w:pStyle w:val="ListParagraph"/>
         <w:numPr>
           <w:ilvl w:val="0"/>
-          <w:numId w:val="2"/>
-        </w:numPr>
-        <w:spacing w:after="90"/>
+          <w:numId w:val="1"/>
+        </w:numPr>
+        <w:spacing w:after="80"/>
       </w:pPr>
       <w:r>
         <w:t xml:space="preserve">7. Cuenta Corriente de Productos</w:t>
@@ -1966,9 +2193,9 @@
         <w:pStyle w:val="ListParagraph"/>
         <w:numPr>
           <w:ilvl w:val="0"/>
-          <w:numId w:val="2"/>
-        </w:numPr>
-        <w:spacing w:after="90"/>
+          <w:numId w:val="1"/>
+        </w:numPr>
+        <w:spacing w:after="80"/>
       </w:pPr>
       <w:r>
         <w:t xml:space="preserve">8. Solicitudes de Compra</w:t>
@@ -1979,9 +2206,9 @@
         <w:pStyle w:val="ListParagraph"/>
         <w:numPr>
           <w:ilvl w:val="0"/>
-          <w:numId w:val="2"/>
-        </w:numPr>
-        <w:spacing w:after="90"/>
+          <w:numId w:val="1"/>
+        </w:numPr>
+        <w:spacing w:after="80"/>
       </w:pPr>
       <w:r>
         <w:t xml:space="preserve">9. Empleados</w:t>
@@ -1992,9 +2219,9 @@
         <w:pStyle w:val="ListParagraph"/>
         <w:numPr>
           <w:ilvl w:val="0"/>
-          <w:numId w:val="2"/>
-        </w:numPr>
-        <w:spacing w:after="90"/>
+          <w:numId w:val="1"/>
+        </w:numPr>
+        <w:spacing w:after="80"/>
       </w:pPr>
       <w:r>
         <w:t xml:space="preserve">10. Tipos</w:t>
@@ -2182,26 +2409,8 @@
       </w:pPr>
     </w:lvl>
   </w:abstractNum>
-  <w:abstractNum w:abstractNumId="2" w15:restartNumberingAfterBreak="0">
-    <w:multiLevelType w:val="hybridMultilevel"/>
-    <w:lvl w:ilvl="0" w15:tentative="1">
-      <w:start w:val="1"/>
-      <w:numFmt w:val="bullet"/>
-      <w:lvlText w:val="•"/>
-      <w:lvlJc w:val="left"/>
-      <w:pPr>
-        <w:ind w:left="420" w:hanging="260"/>
-      </w:pPr>
-    </w:lvl>
-  </w:abstractNum>
   <w:num w:numId="1">
     <w:abstractNumId w:val="1"/>
-    <w:lvlOverride w:ilvl="0">
-      <w:startOverride w:val="1"/>
-    </w:lvlOverride>
-  </w:num>
-  <w:num w:numId="2">
-    <w:abstractNumId w:val="2"/>
     <w:lvlOverride w:ilvl="0">
       <w:startOverride w:val="1"/>
     </w:lvlOverride>

</xml_diff>